<commit_message>
docs: define round-robin pause behaviour
</commit_message>
<xml_diff>
--- a/docs/AS_Fincare_CRM_Product_Spec_V1.docx
+++ b/docs/AS_Fincare_CRM_Product_Spec_V1.docx
@@ -190,7 +190,7 @@
           <w:tab/>
         </w:r>
         <w:r>
-          <w:t>12</w:t>
+          <w:t>13</w:t>
         </w:r>
       </w:hyperlink>
     </w:p>
@@ -209,7 +209,7 @@
           <w:tab/>
         </w:r>
         <w:r>
-          <w:t>13</w:t>
+          <w:t>14</w:t>
         </w:r>
       </w:hyperlink>
     </w:p>
@@ -228,7 +228,7 @@
           <w:tab/>
         </w:r>
         <w:r>
-          <w:t>13</w:t>
+          <w:t>14</w:t>
         </w:r>
       </w:hyperlink>
     </w:p>
@@ -342,7 +342,7 @@
           <w:tab/>
         </w:r>
         <w:r>
-          <w:t>18</w:t>
+          <w:t>19</w:t>
         </w:r>
       </w:hyperlink>
     </w:p>
@@ -361,7 +361,7 @@
           <w:tab/>
         </w:r>
         <w:r>
-          <w:t>19</w:t>
+          <w:t>20</w:t>
         </w:r>
       </w:hyperlink>
     </w:p>
@@ -418,7 +418,7 @@
           <w:tab/>
         </w:r>
         <w:r>
-          <w:t>21</w:t>
+          <w:t>22</w:t>
         </w:r>
       </w:hyperlink>
     </w:p>
@@ -456,7 +456,7 @@
           <w:tab/>
         </w:r>
         <w:r>
-          <w:t>22</w:t>
+          <w:t>23</w:t>
         </w:r>
       </w:hyperlink>
     </w:p>
@@ -494,7 +494,7 @@
           <w:tab/>
         </w:r>
         <w:r>
-          <w:t>23</w:t>
+          <w:t>24</w:t>
         </w:r>
       </w:hyperlink>
     </w:p>
@@ -513,7 +513,7 @@
           <w:tab/>
         </w:r>
         <w:r>
-          <w:t>23</w:t>
+          <w:t>24</w:t>
         </w:r>
       </w:hyperlink>
     </w:p>
@@ -551,7 +551,7 @@
           <w:tab/>
         </w:r>
         <w:r>
-          <w:t>24</w:t>
+          <w:t>25</w:t>
         </w:r>
       </w:hyperlink>
     </w:p>
@@ -627,7 +627,7 @@
           <w:tab/>
         </w:r>
         <w:r>
-          <w:t>27</w:t>
+          <w:t>28</w:t>
         </w:r>
       </w:hyperlink>
     </w:p>
@@ -646,7 +646,7 @@
           <w:tab/>
         </w:r>
         <w:r>
-          <w:t>28</w:t>
+          <w:t>29</w:t>
         </w:r>
       </w:hyperlink>
     </w:p>
@@ -665,7 +665,7 @@
           <w:tab/>
         </w:r>
         <w:r>
-          <w:t>28</w:t>
+          <w:t>29</w:t>
         </w:r>
       </w:hyperlink>
     </w:p>
@@ -684,7 +684,7 @@
           <w:tab/>
         </w:r>
         <w:r>
-          <w:t>29</w:t>
+          <w:t>30</w:t>
         </w:r>
       </w:hyperlink>
     </w:p>
@@ -703,7 +703,7 @@
           <w:tab/>
         </w:r>
         <w:r>
-          <w:t>29</w:t>
+          <w:t>30</w:t>
         </w:r>
       </w:hyperlink>
     </w:p>
@@ -722,7 +722,7 @@
           <w:tab/>
         </w:r>
         <w:r>
-          <w:t>30</w:t>
+          <w:t>31</w:t>
         </w:r>
       </w:hyperlink>
     </w:p>
@@ -779,7 +779,7 @@
           <w:tab/>
         </w:r>
         <w:r>
-          <w:t>32</w:t>
+          <w:t>33</w:t>
         </w:r>
       </w:hyperlink>
     </w:p>
@@ -798,7 +798,7 @@
           <w:tab/>
         </w:r>
         <w:r>
-          <w:t>33</w:t>
+          <w:t>34</w:t>
         </w:r>
       </w:hyperlink>
     </w:p>
@@ -817,7 +817,7 @@
           <w:tab/>
         </w:r>
         <w:r>
-          <w:t>34</w:t>
+          <w:t>35</w:t>
         </w:r>
       </w:hyperlink>
     </w:p>
@@ -836,7 +836,7 @@
           <w:tab/>
         </w:r>
         <w:r>
-          <w:t>35</w:t>
+          <w:t>36</w:t>
         </w:r>
       </w:hyperlink>
     </w:p>
@@ -855,7 +855,7 @@
           <w:tab/>
         </w:r>
         <w:r>
-          <w:t>36</w:t>
+          <w:t>37</w:t>
         </w:r>
       </w:hyperlink>
     </w:p>
@@ -893,7 +893,7 @@
           <w:tab/>
         </w:r>
         <w:r>
-          <w:t>37</w:t>
+          <w:t>38</w:t>
         </w:r>
       </w:hyperlink>
     </w:p>
@@ -912,7 +912,7 @@
           <w:tab/>
         </w:r>
         <w:r>
-          <w:t>38</w:t>
+          <w:t>39</w:t>
         </w:r>
       </w:hyperlink>
     </w:p>
@@ -931,7 +931,7 @@
           <w:tab/>
         </w:r>
         <w:r>
-          <w:t>38</w:t>
+          <w:t>39</w:t>
         </w:r>
       </w:hyperlink>
     </w:p>
@@ -969,7 +969,7 @@
           <w:tab/>
         </w:r>
         <w:r>
-          <w:t>41</w:t>
+          <w:t>42</w:t>
         </w:r>
       </w:hyperlink>
     </w:p>
@@ -1007,7 +1007,7 @@
           <w:tab/>
         </w:r>
         <w:r>
-          <w:t>44</w:t>
+          <w:t>45</w:t>
         </w:r>
       </w:hyperlink>
     </w:p>
@@ -1026,7 +1026,7 @@
           <w:tab/>
         </w:r>
         <w:r>
-          <w:t>45</w:t>
+          <w:t>46</w:t>
         </w:r>
       </w:hyperlink>
     </w:p>
@@ -1045,7 +1045,7 @@
           <w:tab/>
         </w:r>
         <w:r>
-          <w:t>45</w:t>
+          <w:t>46</w:t>
         </w:r>
       </w:hyperlink>
     </w:p>
@@ -1064,7 +1064,7 @@
           <w:tab/>
         </w:r>
         <w:r>
-          <w:t>46</w:t>
+          <w:t>47</w:t>
         </w:r>
       </w:hyperlink>
     </w:p>
@@ -1083,7 +1083,7 @@
           <w:tab/>
         </w:r>
         <w:r>
-          <w:t>47</w:t>
+          <w:t>48</w:t>
         </w:r>
       </w:hyperlink>
     </w:p>
@@ -1140,7 +1140,7 @@
           <w:tab/>
         </w:r>
         <w:r>
-          <w:t>50</w:t>
+          <w:t>51</w:t>
         </w:r>
       </w:hyperlink>
     </w:p>
@@ -1178,7 +1178,7 @@
           <w:tab/>
         </w:r>
         <w:r>
-          <w:t>51</w:t>
+          <w:t>52</w:t>
         </w:r>
       </w:hyperlink>
     </w:p>
@@ -1216,7 +1216,7 @@
           <w:tab/>
         </w:r>
         <w:r>
-          <w:t>53</w:t>
+          <w:t>54</w:t>
         </w:r>
       </w:hyperlink>
     </w:p>
@@ -1235,7 +1235,7 @@
           <w:tab/>
         </w:r>
         <w:r>
-          <w:t>53</w:t>
+          <w:t>54</w:t>
         </w:r>
       </w:hyperlink>
     </w:p>
@@ -1273,7 +1273,7 @@
           <w:tab/>
         </w:r>
         <w:r>
-          <w:t>55</w:t>
+          <w:t>56</w:t>
         </w:r>
       </w:hyperlink>
     </w:p>
@@ -1292,7 +1292,7 @@
           <w:tab/>
         </w:r>
         <w:r>
-          <w:t>56</w:t>
+          <w:t>57</w:t>
         </w:r>
       </w:hyperlink>
     </w:p>
@@ -1330,7 +1330,7 @@
           <w:tab/>
         </w:r>
         <w:r>
-          <w:t>57</w:t>
+          <w:t>58</w:t>
         </w:r>
       </w:hyperlink>
     </w:p>
@@ -1349,7 +1349,7 @@
           <w:tab/>
         </w:r>
         <w:r>
-          <w:t>58</w:t>
+          <w:t>59</w:t>
         </w:r>
       </w:hyperlink>
     </w:p>
@@ -1387,7 +1387,7 @@
           <w:tab/>
         </w:r>
         <w:r>
-          <w:t>61</w:t>
+          <w:t>62</w:t>
         </w:r>
       </w:hyperlink>
     </w:p>
@@ -1425,7 +1425,7 @@
           <w:tab/>
         </w:r>
         <w:r>
-          <w:t>62</w:t>
+          <w:t>63</w:t>
         </w:r>
       </w:hyperlink>
     </w:p>
@@ -1444,7 +1444,7 @@
           <w:tab/>
         </w:r>
         <w:r>
-          <w:t>62</w:t>
+          <w:t>63</w:t>
         </w:r>
       </w:hyperlink>
     </w:p>
@@ -1463,7 +1463,7 @@
           <w:tab/>
         </w:r>
         <w:r>
-          <w:t>63</w:t>
+          <w:t>64</w:t>
         </w:r>
       </w:hyperlink>
     </w:p>
@@ -1482,7 +1482,7 @@
           <w:tab/>
         </w:r>
         <w:r>
-          <w:t>64</w:t>
+          <w:t>65</w:t>
         </w:r>
       </w:hyperlink>
     </w:p>
@@ -1501,7 +1501,7 @@
           <w:tab/>
         </w:r>
         <w:r>
-          <w:t>65</w:t>
+          <w:t>66</w:t>
         </w:r>
       </w:hyperlink>
     </w:p>
@@ -1520,7 +1520,7 @@
           <w:tab/>
         </w:r>
         <w:r>
-          <w:t>66</w:t>
+          <w:t>67</w:t>
         </w:r>
       </w:hyperlink>
     </w:p>
@@ -1615,7 +1615,7 @@
           <w:tab/>
         </w:r>
         <w:r>
-          <w:t>71</w:t>
+          <w:t>72</w:t>
         </w:r>
       </w:hyperlink>
     </w:p>
@@ -1634,7 +1634,7 @@
           <w:tab/>
         </w:r>
         <w:r>
-          <w:t>72</w:t>
+          <w:t>73</w:t>
         </w:r>
       </w:hyperlink>
     </w:p>
@@ -1653,7 +1653,7 @@
           <w:tab/>
         </w:r>
         <w:r>
-          <w:t>73</w:t>
+          <w:t>74</w:t>
         </w:r>
       </w:hyperlink>
     </w:p>
@@ -1672,7 +1672,7 @@
           <w:tab/>
         </w:r>
         <w:r>
-          <w:t>73</w:t>
+          <w:t>74</w:t>
         </w:r>
       </w:hyperlink>
     </w:p>
@@ -1691,7 +1691,7 @@
           <w:tab/>
         </w:r>
         <w:r>
-          <w:t>74</w:t>
+          <w:t>75</w:t>
         </w:r>
       </w:hyperlink>
     </w:p>
@@ -1710,7 +1710,7 @@
           <w:tab/>
         </w:r>
         <w:r>
-          <w:t>75</w:t>
+          <w:t>76</w:t>
         </w:r>
       </w:hyperlink>
     </w:p>
@@ -1729,7 +1729,7 @@
           <w:tab/>
         </w:r>
         <w:r>
-          <w:t>75</w:t>
+          <w:t>76</w:t>
         </w:r>
       </w:hyperlink>
     </w:p>
@@ -1748,7 +1748,7 @@
           <w:tab/>
         </w:r>
         <w:r>
-          <w:t>76</w:t>
+          <w:t>77</w:t>
         </w:r>
       </w:hyperlink>
     </w:p>
@@ -1767,7 +1767,7 @@
           <w:tab/>
         </w:r>
         <w:r>
-          <w:t>77</w:t>
+          <w:t>78</w:t>
         </w:r>
       </w:hyperlink>
     </w:p>
@@ -1786,7 +1786,7 @@
           <w:tab/>
         </w:r>
         <w:r>
-          <w:t>78</w:t>
+          <w:t>79</w:t>
         </w:r>
       </w:hyperlink>
     </w:p>
@@ -1805,7 +1805,7 @@
           <w:tab/>
         </w:r>
         <w:r>
-          <w:t>78</w:t>
+          <w:t>79</w:t>
         </w:r>
       </w:hyperlink>
     </w:p>
@@ -1824,7 +1824,7 @@
           <w:tab/>
         </w:r>
         <w:r>
-          <w:t>79</w:t>
+          <w:t>80</w:t>
         </w:r>
       </w:hyperlink>
     </w:p>
@@ -1843,7 +1843,7 @@
           <w:tab/>
         </w:r>
         <w:r>
-          <w:t>79</w:t>
+          <w:t>80</w:t>
         </w:r>
       </w:hyperlink>
     </w:p>
@@ -1862,7 +1862,7 @@
           <w:tab/>
         </w:r>
         <w:r>
-          <w:t>80</w:t>
+          <w:t>81</w:t>
         </w:r>
       </w:hyperlink>
     </w:p>
@@ -1881,7 +1881,7 @@
           <w:tab/>
         </w:r>
         <w:r>
-          <w:t>81</w:t>
+          <w:t>82</w:t>
         </w:r>
       </w:hyperlink>
     </w:p>
@@ -1900,7 +1900,7 @@
           <w:tab/>
         </w:r>
         <w:r>
-          <w:t>82</w:t>
+          <w:t>83</w:t>
         </w:r>
       </w:hyperlink>
     </w:p>
@@ -1919,7 +1919,7 @@
           <w:tab/>
         </w:r>
         <w:r>
-          <w:t>82</w:t>
+          <w:t>83</w:t>
         </w:r>
       </w:hyperlink>
     </w:p>
@@ -1976,7 +1976,7 @@
           <w:tab/>
         </w:r>
         <w:r>
-          <w:t>85</w:t>
+          <w:t>86</w:t>
         </w:r>
       </w:hyperlink>
     </w:p>
@@ -1995,7 +1995,7 @@
           <w:tab/>
         </w:r>
         <w:r>
-          <w:t>86</w:t>
+          <w:t>87</w:t>
         </w:r>
       </w:hyperlink>
     </w:p>
@@ -2014,7 +2014,7 @@
           <w:tab/>
         </w:r>
         <w:r>
-          <w:t>86</w:t>
+          <w:t>87</w:t>
         </w:r>
       </w:hyperlink>
     </w:p>
@@ -2090,7 +2090,7 @@
           <w:tab/>
         </w:r>
         <w:r>
-          <w:t>90</w:t>
+          <w:t>91</w:t>
         </w:r>
       </w:hyperlink>
     </w:p>
@@ -2166,7 +2166,7 @@
           <w:tab/>
         </w:r>
         <w:r>
-          <w:t>94</w:t>
+          <w:t>95</w:t>
         </w:r>
       </w:hyperlink>
     </w:p>
@@ -2204,7 +2204,7 @@
           <w:tab/>
         </w:r>
         <w:r>
-          <w:t>96</w:t>
+          <w:t>97</w:t>
         </w:r>
       </w:hyperlink>
     </w:p>
@@ -2223,7 +2223,7 @@
           <w:tab/>
         </w:r>
         <w:r>
-          <w:t>97</w:t>
+          <w:t>98</w:t>
         </w:r>
       </w:hyperlink>
     </w:p>
@@ -2261,7 +2261,7 @@
           <w:tab/>
         </w:r>
         <w:r>
-          <w:t>98</w:t>
+          <w:t>99</w:t>
         </w:r>
       </w:hyperlink>
     </w:p>
@@ -2299,7 +2299,7 @@
           <w:tab/>
         </w:r>
         <w:r>
-          <w:t>100</w:t>
+          <w:t>101</w:t>
         </w:r>
       </w:hyperlink>
     </w:p>
@@ -2337,7 +2337,7 @@
           <w:tab/>
         </w:r>
         <w:r>
-          <w:t>101</w:t>
+          <w:t>102</w:t>
         </w:r>
       </w:hyperlink>
     </w:p>
@@ -2375,7 +2375,7 @@
           <w:tab/>
         </w:r>
         <w:r>
-          <w:t>102</w:t>
+          <w:t>103</w:t>
         </w:r>
       </w:hyperlink>
     </w:p>
@@ -2432,7 +2432,7 @@
           <w:tab/>
         </w:r>
         <w:r>
-          <w:t>104</w:t>
+          <w:t>105</w:t>
         </w:r>
       </w:hyperlink>
     </w:p>
@@ -2451,7 +2451,7 @@
           <w:tab/>
         </w:r>
         <w:r>
-          <w:t>105</w:t>
+          <w:t>106</w:t>
         </w:r>
       </w:hyperlink>
     </w:p>
@@ -2489,7 +2489,7 @@
           <w:tab/>
         </w:r>
         <w:r>
-          <w:t>106</w:t>
+          <w:t>107</w:t>
         </w:r>
       </w:hyperlink>
     </w:p>
@@ -2527,7 +2527,7 @@
           <w:tab/>
         </w:r>
         <w:r>
-          <w:t>107</w:t>
+          <w:t>108</w:t>
         </w:r>
       </w:hyperlink>
     </w:p>
@@ -2660,7 +2660,7 @@
           <w:tab/>
         </w:r>
         <w:r>
-          <w:t>112</w:t>
+          <w:t>113</w:t>
         </w:r>
       </w:hyperlink>
     </w:p>
@@ -2679,7 +2679,7 @@
           <w:tab/>
         </w:r>
         <w:r>
-          <w:t>113</w:t>
+          <w:t>114</w:t>
         </w:r>
       </w:hyperlink>
     </w:p>
@@ -2698,7 +2698,7 @@
           <w:tab/>
         </w:r>
         <w:r>
-          <w:t>114</w:t>
+          <w:t>115</w:t>
         </w:r>
       </w:hyperlink>
     </w:p>
@@ -2717,7 +2717,7 @@
           <w:tab/>
         </w:r>
         <w:r>
-          <w:t>115</w:t>
+          <w:t>116</w:t>
         </w:r>
       </w:hyperlink>
     </w:p>
@@ -2736,7 +2736,7 @@
           <w:tab/>
         </w:r>
         <w:r>
-          <w:t>116</w:t>
+          <w:t>117</w:t>
         </w:r>
       </w:hyperlink>
     </w:p>
@@ -2755,7 +2755,7 @@
           <w:tab/>
         </w:r>
         <w:r>
-          <w:t>117</w:t>
+          <w:t>118</w:t>
         </w:r>
       </w:hyperlink>
     </w:p>
@@ -2774,7 +2774,7 @@
           <w:tab/>
         </w:r>
         <w:r>
-          <w:t>117</w:t>
+          <w:t>118</w:t>
         </w:r>
       </w:hyperlink>
     </w:p>
@@ -2793,7 +2793,7 @@
           <w:tab/>
         </w:r>
         <w:r>
-          <w:t>118</w:t>
+          <w:t>119</w:t>
         </w:r>
       </w:hyperlink>
     </w:p>
@@ -2812,7 +2812,7 @@
           <w:tab/>
         </w:r>
         <w:r>
-          <w:t>119</w:t>
+          <w:t>120</w:t>
         </w:r>
       </w:hyperlink>
     </w:p>
@@ -2831,7 +2831,7 @@
           <w:tab/>
         </w:r>
         <w:r>
-          <w:t>120</w:t>
+          <w:t>121</w:t>
         </w:r>
       </w:hyperlink>
     </w:p>
@@ -2850,7 +2850,7 @@
           <w:tab/>
         </w:r>
         <w:r>
-          <w:t>120</w:t>
+          <w:t>121</w:t>
         </w:r>
       </w:hyperlink>
     </w:p>
@@ -2869,7 +2869,7 @@
           <w:tab/>
         </w:r>
         <w:r>
-          <w:t>121</w:t>
+          <w:t>122</w:t>
         </w:r>
       </w:hyperlink>
     </w:p>
@@ -2888,7 +2888,7 @@
           <w:tab/>
         </w:r>
         <w:r>
-          <w:t>122</w:t>
+          <w:t>123</w:t>
         </w:r>
       </w:hyperlink>
     </w:p>
@@ -2907,7 +2907,7 @@
           <w:tab/>
         </w:r>
         <w:r>
-          <w:t>123</w:t>
+          <w:t>124</w:t>
         </w:r>
       </w:hyperlink>
     </w:p>
@@ -2926,7 +2926,7 @@
           <w:tab/>
         </w:r>
         <w:r>
-          <w:t>123</w:t>
+          <w:t>124</w:t>
         </w:r>
       </w:hyperlink>
     </w:p>
@@ -2945,7 +2945,7 @@
           <w:tab/>
         </w:r>
         <w:r>
-          <w:t>125</w:t>
+          <w:t>126</w:t>
         </w:r>
       </w:hyperlink>
     </w:p>
@@ -2964,7 +2964,7 @@
           <w:tab/>
         </w:r>
         <w:r>
-          <w:t>126</w:t>
+          <w:t>127</w:t>
         </w:r>
       </w:hyperlink>
     </w:p>
@@ -2983,7 +2983,7 @@
           <w:tab/>
         </w:r>
         <w:r>
-          <w:t>127</w:t>
+          <w:t>128</w:t>
         </w:r>
       </w:hyperlink>
     </w:p>
@@ -3002,7 +3002,7 @@
           <w:tab/>
         </w:r>
         <w:r>
-          <w:t>128</w:t>
+          <w:t>129</w:t>
         </w:r>
       </w:hyperlink>
     </w:p>
@@ -3021,7 +3021,7 @@
           <w:tab/>
         </w:r>
         <w:r>
-          <w:t>128</w:t>
+          <w:t>129</w:t>
         </w:r>
       </w:hyperlink>
     </w:p>
@@ -3040,7 +3040,7 @@
           <w:tab/>
         </w:r>
         <w:r>
-          <w:t>129</w:t>
+          <w:t>130</w:t>
         </w:r>
       </w:hyperlink>
     </w:p>
@@ -3059,7 +3059,7 @@
           <w:tab/>
         </w:r>
         <w:r>
-          <w:t>129</w:t>
+          <w:t>130</w:t>
         </w:r>
       </w:hyperlink>
     </w:p>
@@ -3078,7 +3078,7 @@
           <w:tab/>
         </w:r>
         <w:r>
-          <w:t>130</w:t>
+          <w:t>131</w:t>
         </w:r>
       </w:hyperlink>
     </w:p>
@@ -3097,7 +3097,7 @@
           <w:tab/>
         </w:r>
         <w:r>
-          <w:t>130</w:t>
+          <w:t>131</w:t>
         </w:r>
       </w:hyperlink>
     </w:p>
@@ -3116,7 +3116,7 @@
           <w:tab/>
         </w:r>
         <w:r>
-          <w:t>131</w:t>
+          <w:t>132</w:t>
         </w:r>
       </w:hyperlink>
     </w:p>
@@ -3135,7 +3135,7 @@
           <w:tab/>
         </w:r>
         <w:r>
-          <w:t>131</w:t>
+          <w:t>132</w:t>
         </w:r>
       </w:hyperlink>
     </w:p>
@@ -3154,7 +3154,7 @@
           <w:tab/>
         </w:r>
         <w:r>
-          <w:t>132</w:t>
+          <w:t>133</w:t>
         </w:r>
       </w:hyperlink>
     </w:p>
@@ -3173,7 +3173,7 @@
           <w:tab/>
         </w:r>
         <w:r>
-          <w:t>133</w:t>
+          <w:t>134</w:t>
         </w:r>
       </w:hyperlink>
     </w:p>
@@ -3192,7 +3192,7 @@
           <w:tab/>
         </w:r>
         <w:r>
-          <w:t>133</w:t>
+          <w:t>134</w:t>
         </w:r>
       </w:hyperlink>
     </w:p>
@@ -3211,7 +3211,7 @@
           <w:tab/>
         </w:r>
         <w:r>
-          <w:t>134</w:t>
+          <w:t>135</w:t>
         </w:r>
       </w:hyperlink>
     </w:p>
@@ -3230,7 +3230,7 @@
           <w:tab/>
         </w:r>
         <w:r>
-          <w:t>135</w:t>
+          <w:t>136</w:t>
         </w:r>
       </w:hyperlink>
     </w:p>
@@ -3249,7 +3249,7 @@
           <w:tab/>
         </w:r>
         <w:r>
-          <w:t>136</w:t>
+          <w:t>137</w:t>
         </w:r>
       </w:hyperlink>
     </w:p>
@@ -3268,7 +3268,7 @@
           <w:tab/>
         </w:r>
         <w:r>
-          <w:t>136</w:t>
+          <w:t>138</w:t>
         </w:r>
       </w:hyperlink>
     </w:p>
@@ -3287,7 +3287,7 @@
           <w:tab/>
         </w:r>
         <w:r>
-          <w:t>137</w:t>
+          <w:t>138</w:t>
         </w:r>
       </w:hyperlink>
     </w:p>
@@ -3306,7 +3306,7 @@
           <w:tab/>
         </w:r>
         <w:r>
-          <w:t>137</w:t>
+          <w:t>139</w:t>
         </w:r>
       </w:hyperlink>
     </w:p>
@@ -3325,7 +3325,7 @@
           <w:tab/>
         </w:r>
         <w:r>
-          <w:t>138</w:t>
+          <w:t>139</w:t>
         </w:r>
       </w:hyperlink>
     </w:p>
@@ -3344,7 +3344,7 @@
           <w:tab/>
         </w:r>
         <w:r>
-          <w:t>139</w:t>
+          <w:t>140</w:t>
         </w:r>
       </w:hyperlink>
     </w:p>
@@ -3363,7 +3363,7 @@
           <w:tab/>
         </w:r>
         <w:r>
-          <w:t>139</w:t>
+          <w:t>140</w:t>
         </w:r>
       </w:hyperlink>
     </w:p>
@@ -3382,7 +3382,7 @@
           <w:tab/>
         </w:r>
         <w:r>
-          <w:t>139</w:t>
+          <w:t>141</w:t>
         </w:r>
       </w:hyperlink>
     </w:p>
@@ -3401,7 +3401,7 @@
           <w:tab/>
         </w:r>
         <w:r>
-          <w:t>140</w:t>
+          <w:t>141</w:t>
         </w:r>
       </w:hyperlink>
     </w:p>
@@ -3420,7 +3420,7 @@
           <w:tab/>
         </w:r>
         <w:r>
-          <w:t>141</w:t>
+          <w:t>142</w:t>
         </w:r>
       </w:hyperlink>
     </w:p>
@@ -3439,7 +3439,7 @@
           <w:tab/>
         </w:r>
         <w:r>
-          <w:t>142</w:t>
+          <w:t>143</w:t>
         </w:r>
       </w:hyperlink>
     </w:p>
@@ -3458,7 +3458,7 @@
           <w:tab/>
         </w:r>
         <w:r>
-          <w:t>143</w:t>
+          <w:t>144</w:t>
         </w:r>
       </w:hyperlink>
     </w:p>
@@ -3477,7 +3477,7 @@
           <w:tab/>
         </w:r>
         <w:r>
-          <w:t>143</w:t>
+          <w:t>144</w:t>
         </w:r>
       </w:hyperlink>
     </w:p>
@@ -3496,7 +3496,7 @@
           <w:tab/>
         </w:r>
         <w:r>
-          <w:t>144</w:t>
+          <w:t>145</w:t>
         </w:r>
       </w:hyperlink>
     </w:p>
@@ -3515,7 +3515,7 @@
           <w:tab/>
         </w:r>
         <w:r>
-          <w:t>144</w:t>
+          <w:t>146</w:t>
         </w:r>
       </w:hyperlink>
     </w:p>
@@ -3534,7 +3534,7 @@
           <w:tab/>
         </w:r>
         <w:r>
-          <w:t>145</w:t>
+          <w:t>146</w:t>
         </w:r>
       </w:hyperlink>
     </w:p>
@@ -3553,7 +3553,7 @@
           <w:tab/>
         </w:r>
         <w:r>
-          <w:t>145</w:t>
+          <w:t>147</w:t>
         </w:r>
       </w:hyperlink>
     </w:p>
@@ -3572,7 +3572,7 @@
           <w:tab/>
         </w:r>
         <w:r>
-          <w:t>146</w:t>
+          <w:t>147</w:t>
         </w:r>
       </w:hyperlink>
     </w:p>
@@ -3591,7 +3591,7 @@
           <w:tab/>
         </w:r>
         <w:r>
-          <w:t>147</w:t>
+          <w:t>148</w:t>
         </w:r>
       </w:hyperlink>
     </w:p>
@@ -3610,7 +3610,7 @@
           <w:tab/>
         </w:r>
         <w:r>
-          <w:t>149</w:t>
+          <w:t>151</w:t>
         </w:r>
       </w:hyperlink>
     </w:p>
@@ -3629,7 +3629,7 @@
           <w:tab/>
         </w:r>
         <w:r>
-          <w:t>150</w:t>
+          <w:t>152</w:t>
         </w:r>
       </w:hyperlink>
     </w:p>
@@ -3648,7 +3648,7 @@
           <w:tab/>
         </w:r>
         <w:r>
-          <w:t>152</w:t>
+          <w:t>153</w:t>
         </w:r>
       </w:hyperlink>
     </w:p>
@@ -3667,7 +3667,7 @@
           <w:tab/>
         </w:r>
         <w:r>
-          <w:t>153</w:t>
+          <w:t>154</w:t>
         </w:r>
       </w:hyperlink>
     </w:p>
@@ -3686,7 +3686,7 @@
           <w:tab/>
         </w:r>
         <w:r>
-          <w:t>155</w:t>
+          <w:t>156</w:t>
         </w:r>
       </w:hyperlink>
     </w:p>
@@ -3705,7 +3705,7 @@
           <w:tab/>
         </w:r>
         <w:r>
-          <w:t>157</w:t>
+          <w:t>158</w:t>
         </w:r>
       </w:hyperlink>
     </w:p>
@@ -3724,7 +3724,7 @@
           <w:tab/>
         </w:r>
         <w:r>
-          <w:t>158</w:t>
+          <w:t>159</w:t>
         </w:r>
       </w:hyperlink>
     </w:p>
@@ -3743,7 +3743,7 @@
           <w:tab/>
         </w:r>
         <w:r>
-          <w:t>158</w:t>
+          <w:t>159</w:t>
         </w:r>
       </w:hyperlink>
     </w:p>
@@ -3762,7 +3762,7 @@
           <w:tab/>
         </w:r>
         <w:r>
-          <w:t>159</w:t>
+          <w:t>160</w:t>
         </w:r>
       </w:hyperlink>
     </w:p>
@@ -3781,7 +3781,7 @@
           <w:tab/>
         </w:r>
         <w:r>
-          <w:t>159</w:t>
+          <w:t>161</w:t>
         </w:r>
       </w:hyperlink>
     </w:p>
@@ -3800,7 +3800,7 @@
           <w:tab/>
         </w:r>
         <w:r>
-          <w:t>160</w:t>
+          <w:t>161</w:t>
         </w:r>
       </w:hyperlink>
     </w:p>
@@ -3819,7 +3819,7 @@
           <w:tab/>
         </w:r>
         <w:r>
-          <w:t>160</w:t>
+          <w:t>161</w:t>
         </w:r>
       </w:hyperlink>
     </w:p>
@@ -3838,7 +3838,7 @@
           <w:tab/>
         </w:r>
         <w:r>
-          <w:t>161</w:t>
+          <w:t>162</w:t>
         </w:r>
       </w:hyperlink>
     </w:p>
@@ -3857,7 +3857,7 @@
           <w:tab/>
         </w:r>
         <w:r>
-          <w:t>162</w:t>
+          <w:t>163</w:t>
         </w:r>
       </w:hyperlink>
     </w:p>
@@ -3876,7 +3876,7 @@
           <w:tab/>
         </w:r>
         <w:r>
-          <w:t>163</w:t>
+          <w:t>165</w:t>
         </w:r>
       </w:hyperlink>
     </w:p>
@@ -3895,7 +3895,7 @@
           <w:tab/>
         </w:r>
         <w:r>
-          <w:t>164</w:t>
+          <w:t>166</w:t>
         </w:r>
       </w:hyperlink>
     </w:p>
@@ -3914,7 +3914,7 @@
           <w:tab/>
         </w:r>
         <w:r>
-          <w:t>165</w:t>
+          <w:t>167</w:t>
         </w:r>
       </w:hyperlink>
     </w:p>
@@ -3933,7 +3933,7 @@
           <w:tab/>
         </w:r>
         <w:r>
-          <w:t>166</w:t>
+          <w:t>168</w:t>
         </w:r>
       </w:hyperlink>
     </w:p>
@@ -3952,7 +3952,7 @@
           <w:tab/>
         </w:r>
         <w:r>
-          <w:t>168</w:t>
+          <w:t>170</w:t>
         </w:r>
       </w:hyperlink>
     </w:p>
@@ -3971,7 +3971,7 @@
           <w:tab/>
         </w:r>
         <w:r>
-          <w:t>169</w:t>
+          <w:t>170</w:t>
         </w:r>
       </w:hyperlink>
     </w:p>
@@ -3990,7 +3990,7 @@
           <w:tab/>
         </w:r>
         <w:r>
-          <w:t>171</w:t>
+          <w:t>173</w:t>
         </w:r>
       </w:hyperlink>
     </w:p>
@@ -4009,7 +4009,7 @@
           <w:tab/>
         </w:r>
         <w:r>
-          <w:t>171</w:t>
+          <w:t>174</w:t>
         </w:r>
       </w:hyperlink>
     </w:p>
@@ -4028,7 +4028,7 @@
           <w:tab/>
         </w:r>
         <w:r>
-          <w:t>172</w:t>
+          <w:t>174</w:t>
         </w:r>
       </w:hyperlink>
     </w:p>
@@ -4047,7 +4047,7 @@
           <w:tab/>
         </w:r>
         <w:r>
-          <w:t>173</w:t>
+          <w:t>176</w:t>
         </w:r>
       </w:hyperlink>
     </w:p>
@@ -4066,7 +4066,7 @@
           <w:tab/>
         </w:r>
         <w:r>
-          <w:t>174</w:t>
+          <w:t>176</w:t>
         </w:r>
       </w:hyperlink>
     </w:p>
@@ -4085,7 +4085,7 @@
           <w:tab/>
         </w:r>
         <w:r>
-          <w:t>174</w:t>
+          <w:t>177</w:t>
         </w:r>
       </w:hyperlink>
     </w:p>
@@ -4104,7 +4104,7 @@
           <w:tab/>
         </w:r>
         <w:r>
-          <w:t>175</w:t>
+          <w:t>177</w:t>
         </w:r>
       </w:hyperlink>
     </w:p>
@@ -4123,7 +4123,7 @@
           <w:tab/>
         </w:r>
         <w:r>
-          <w:t>175</w:t>
+          <w:t>178</w:t>
         </w:r>
       </w:hyperlink>
     </w:p>
@@ -4142,7 +4142,7 @@
           <w:tab/>
         </w:r>
         <w:r>
-          <w:t>176</w:t>
+          <w:t>178</w:t>
         </w:r>
       </w:hyperlink>
     </w:p>
@@ -4161,7 +4161,7 @@
           <w:tab/>
         </w:r>
         <w:r>
-          <w:t>177</w:t>
+          <w:t>180</w:t>
         </w:r>
       </w:hyperlink>
     </w:p>
@@ -4180,7 +4180,7 @@
           <w:tab/>
         </w:r>
         <w:r>
-          <w:t>178</w:t>
+          <w:t>181</w:t>
         </w:r>
       </w:hyperlink>
     </w:p>
@@ -4199,7 +4199,7 @@
           <w:tab/>
         </w:r>
         <w:r>
-          <w:t>179</w:t>
+          <w:t>182</w:t>
         </w:r>
       </w:hyperlink>
     </w:p>
@@ -4218,7 +4218,7 @@
           <w:tab/>
         </w:r>
         <w:r>
-          <w:t>180</w:t>
+          <w:t>183</w:t>
         </w:r>
       </w:hyperlink>
     </w:p>
@@ -4237,7 +4237,7 @@
           <w:tab/>
         </w:r>
         <w:r>
-          <w:t>181</w:t>
+          <w:t>183</w:t>
         </w:r>
       </w:hyperlink>
     </w:p>
@@ -4256,7 +4256,7 @@
           <w:tab/>
         </w:r>
         <w:r>
-          <w:t>182</w:t>
+          <w:t>184</w:t>
         </w:r>
       </w:hyperlink>
     </w:p>
@@ -4275,7 +4275,7 @@
           <w:tab/>
         </w:r>
         <w:r>
-          <w:t>182</w:t>
+          <w:t>185</w:t>
         </w:r>
       </w:hyperlink>
     </w:p>
@@ -4294,7 +4294,7 @@
           <w:tab/>
         </w:r>
         <w:r>
-          <w:t>183</w:t>
+          <w:t>186</w:t>
         </w:r>
       </w:hyperlink>
     </w:p>
@@ -4313,7 +4313,7 @@
           <w:tab/>
         </w:r>
         <w:r>
-          <w:t>184</w:t>
+          <w:t>187</w:t>
         </w:r>
       </w:hyperlink>
     </w:p>
@@ -4332,7 +4332,7 @@
           <w:tab/>
         </w:r>
         <w:r>
-          <w:t>184</w:t>
+          <w:t>187</w:t>
         </w:r>
       </w:hyperlink>
     </w:p>
@@ -4351,7 +4351,7 @@
           <w:tab/>
         </w:r>
         <w:r>
-          <w:t>185</w:t>
+          <w:t>188</w:t>
         </w:r>
       </w:hyperlink>
     </w:p>
@@ -4370,7 +4370,7 @@
           <w:tab/>
         </w:r>
         <w:r>
-          <w:t>186</w:t>
+          <w:t>189</w:t>
         </w:r>
       </w:hyperlink>
     </w:p>
@@ -4389,7 +4389,7 @@
           <w:tab/>
         </w:r>
         <w:r>
-          <w:t>188</w:t>
+          <w:t>191</w:t>
         </w:r>
       </w:hyperlink>
     </w:p>
@@ -4408,7 +4408,7 @@
           <w:tab/>
         </w:r>
         <w:r>
-          <w:t>190</w:t>
+          <w:t>193</w:t>
         </w:r>
       </w:hyperlink>
     </w:p>
@@ -4427,7 +4427,7 @@
           <w:tab/>
         </w:r>
         <w:r>
-          <w:t>192</w:t>
+          <w:t>195</w:t>
         </w:r>
       </w:hyperlink>
     </w:p>
@@ -4446,7 +4446,7 @@
           <w:tab/>
         </w:r>
         <w:r>
-          <w:t>193</w:t>
+          <w:t>196</w:t>
         </w:r>
       </w:hyperlink>
     </w:p>
@@ -4465,7 +4465,7 @@
           <w:tab/>
         </w:r>
         <w:r>
-          <w:t>194</w:t>
+          <w:t>196</w:t>
         </w:r>
       </w:hyperlink>
     </w:p>
@@ -4484,7 +4484,7 @@
           <w:tab/>
         </w:r>
         <w:r>
-          <w:t>195</w:t>
+          <w:t>197</w:t>
         </w:r>
       </w:hyperlink>
     </w:p>
@@ -4503,7 +4503,7 @@
           <w:tab/>
         </w:r>
         <w:r>
-          <w:t>197</w:t>
+          <w:t>200</w:t>
         </w:r>
       </w:hyperlink>
     </w:p>
@@ -4522,7 +4522,7 @@
           <w:tab/>
         </w:r>
         <w:r>
-          <w:t>200</w:t>
+          <w:t>202</w:t>
         </w:r>
       </w:hyperlink>
       <w:r>
@@ -5519,6 +5519,18 @@
         </w:numPr>
       </w:pPr>
       <w:r>
+        <w:t xml:space="preserve">pause or resume any Team Lead from automatic Lead round-robin assignment, anywhere in the organization</w:t>
+      </w:r>
+    </w:p>
+    <w:p>
+      <w:pPr>
+        <w:pStyle w:val="ListBullet"/>
+        <w:numPr>
+          <w:ilvl w:val="0"/>
+          <w:numId w:val="1"/>
+        </w:numPr>
+      </w:pPr>
+      <w:r>
         <w:t xml:space="preserve">access organization-wide dashboards and reports</w:t>
       </w:r>
     </w:p>
@@ -5682,6 +5694,18 @@
         </w:numPr>
       </w:pPr>
       <w:r>
+        <w:t xml:space="preserve">pause or resume a Team Lead who reports to that Manager from automatic Lead round-robin assignment</w:t>
+      </w:r>
+    </w:p>
+    <w:p>
+      <w:pPr>
+        <w:pStyle w:val="ListBullet"/>
+        <w:numPr>
+          <w:ilvl w:val="0"/>
+          <w:numId w:val="1"/>
+        </w:numPr>
+      </w:pPr>
+      <w:r>
         <w:t xml:space="preserve">view dashboards and reports for their own branch</w:t>
       </w:r>
     </w:p>
@@ -5905,6 +5929,18 @@
         </w:numPr>
       </w:pPr>
       <w:r>
+        <w:t xml:space="preserve">may pause or resume a Salesperson in their own team from automatic Lead round-robin assignment</w:t>
+      </w:r>
+    </w:p>
+    <w:p>
+      <w:pPr>
+        <w:pStyle w:val="ListBullet"/>
+        <w:numPr>
+          <w:ilvl w:val="0"/>
+          <w:numId w:val="1"/>
+        </w:numPr>
+      </w:pPr>
+      <w:r>
         <w:t xml:space="preserve">must not see another Team Lead's team</w:t>
       </w:r>
     </w:p>
@@ -6005,6 +6041,33 @@
       </w:pPr>
       <w:r>
         <w:t xml:space="preserve">does not receive organization-wide or peer visibility</w:t>
+      </w:r>
+    </w:p>
+    <w:p>
+      <w:pPr>
+        <w:pStyle w:val="BodyText"/>
+      </w:pPr>
+      <w:r>
+        <w:rPr>
+          <w:b/>
+        </w:rPr>
+        <w:t xml:space="preserve">Pause from round robin</w:t>
+      </w:r>
+    </w:p>
+    <w:p>
+      <w:pPr>
+        <w:pStyle w:val="BodyText"/>
+      </w:pPr>
+      <w:r>
+        <w:t xml:space="preserve">A Team Lead or Salesperson may be paused from automatic Lead round-robin assignment. A Team Lead may pause or resume a Salesperson in their own team; a Team Lead may be paused or resumed only by the Manager to whom that Team Lead reports, or by an Admin. No other role holds this authority.</w:t>
+      </w:r>
+    </w:p>
+    <w:p>
+      <w:pPr>
+        <w:pStyle w:val="BodyText"/>
+      </w:pPr>
+      <w:r>
+        <w:t xml:space="preserve">This control governs automatic Lead distribution only. It does not deactivate the user, does not change record visibility, ownership or any other permission, and does not prevent an authorized manual or direct assignment. The full behaviour is defined in Section 189.1.</w:t>
       </w:r>
     </w:p>
     <w:p>
@@ -15299,7 +15362,7 @@
         </w:numPr>
       </w:pPr>
       <w:r>
-        <w:t xml:space="preserve">If no eligible active recipient exists in the selected team, assignment fails safely and the Lead may remain Unassigned against that team. It is never given to an Admin, a Manager or a user from another team.</w:t>
+        <w:t xml:space="preserve">If no eligible automatic recipient exists in the selected team — every otherwise eligible member being inactive or paused from round robin — assignment fails safely and the Lead may remain Unassigned against that team. It is never given to an Admin, a Manager or a user from another team.</w:t>
       </w:r>
     </w:p>
     <w:p>
@@ -19528,15 +19591,15 @@
         <w:pStyle w:val="BodyText"/>
       </w:pPr>
       <w:r>
-        <w:t xml:space="preserve">Automatic assignment is scoped to a single destination team. The eligible pool is that team's active Team Lead and active Salespersons. Admins, Managers, inactive users and users from other teams are never eligible recipients.</w:t>
-      </w:r>
-    </w:p>
-    <w:p>
-      <w:pPr>
-        <w:pStyle w:val="BodyText"/>
-      </w:pPr>
-      <w:r>
-        <w:t xml:space="preserve">If the destination team has no eligible active recipient, assignment fails safely: the Lead is not given to an Admin, a Manager or a user from another team, and the condition is surfaced rather than ignored. See Section 189.1.</w:t>
+        <w:t xml:space="preserve">Automatic assignment is scoped to a single destination team. The eligible pool is that team's active Team Lead and active Salespersons who are not paused from round robin. Admins, Managers, inactive users, users paused from round robin and users from other teams are never eligible recipients.</w:t>
+      </w:r>
+    </w:p>
+    <w:p>
+      <w:pPr>
+        <w:pStyle w:val="BodyText"/>
+      </w:pPr>
+      <w:r>
+        <w:t xml:space="preserve">If the destination team has no eligible automatic recipient, assignment fails safely: the Lead is not given to an Admin, a Manager or a user from another team, and the condition is surfaced rather than ignored. See Section 189.1.</w:t>
       </w:r>
     </w:p>
     <w:p>
@@ -33319,7 +33382,15 @@
         <w:pStyle w:val="BodyText"/>
       </w:pPr>
       <w:r>
-        <w:t xml:space="preserve">Round robin continues to apply to the ordinary Lead-assignment paths defined elsewhere in this specification, including authorized manual Lead creation and bulk import. Those paths remain team-scoped, with a pool containing the team's active Team Lead and active Salespersons. See Sections 189 and 189.1.</w:t>
+        <w:t xml:space="preserve">Round robin continues to apply to the ordinary Lead-assignment paths defined elsewhere in this specification, including authorized manual Lead creation and bulk import. Those paths remain team-scoped, with a pool containing the team's active Team Lead and active Salespersons who are not paused from round robin. See Sections 189 and 189.1.</w:t>
+      </w:r>
+    </w:p>
+    <w:p>
+      <w:pPr>
+        <w:pStyle w:val="BodyText"/>
+      </w:pPr>
+      <w:r>
+        <w:t xml:space="preserve">Because this is a direct assignment rather than a rotation, round-robin pause status does not affect it: the selected Team Lead must be active, but may be paused from round robin.</w:t>
       </w:r>
     </w:p>
     <w:p>
@@ -44828,7 +44899,19 @@
         <w:rPr>
           <w:b/>
         </w:rPr>
-        <w:t xml:space="preserve">active Team Lead and active Salespersons</w:t>
+        <w:t xml:space="preserve">active Team Lead and active Salespersons who are not paused from round robin</w:t>
+      </w:r>
+    </w:p>
+    <w:p>
+      <w:pPr>
+        <w:pStyle w:val="ListBullet"/>
+        <w:numPr>
+          <w:ilvl w:val="0"/>
+          <w:numId w:val="1"/>
+        </w:numPr>
+      </w:pPr>
+      <w:r>
+        <w:t xml:space="preserve">members paused from round robin are excluded from the displayed eligible-recipient list and from the automatic distribution</w:t>
       </w:r>
     </w:p>
     <w:p>
@@ -44885,7 +44968,7 @@
         </w:numPr>
       </w:pPr>
       <w:r>
-        <w:t xml:space="preserve">if the team has no eligible active recipient, the strategy is invalid and the import cannot proceed on it</w:t>
+        <w:t xml:space="preserve">if the team has no eligible automatic recipient, the strategy is invalid and the import cannot proceed on it</w:t>
       </w:r>
     </w:p>
     <w:p>
@@ -44912,6 +44995,14 @@
         <w:pStyle w:val="BodyText"/>
       </w:pPr>
       <w:r>
+        <w:t xml:space="preserve">Direct assignment does not use round-robin pause status. An active person who is paused from round robin remains selectable, and remains a valid destination, whenever the importing user is authorized to assign to them. Pausing withholds someone from automatic distribution only; it never blocks an explicit choice. See Section 189.1.</w:t>
+      </w:r>
+    </w:p>
+    <w:p>
+      <w:pPr>
+        <w:pStyle w:val="BodyText"/>
+      </w:pPr>
+      <w:r>
         <w:rPr>
           <w:b/>
         </w:rPr>
@@ -45206,19 +45297,19 @@
         </w:numPr>
       </w:pPr>
       <w:r>
-        <w:t xml:space="preserve">the selected Team Lead or Salesperson is still active and still within the importing user's permitted scope</w:t>
-      </w:r>
-    </w:p>
-    <w:p>
-      <w:pPr>
-        <w:pStyle w:val="ListBullet"/>
-        <w:numPr>
-          <w:ilvl w:val="0"/>
-          <w:numId w:val="1"/>
-        </w:numPr>
-      </w:pPr>
-      <w:r>
-        <w:t xml:space="preserve">the selected team still has at least one eligible active recipient</w:t>
+        <w:t xml:space="preserve">the selected Team Lead or Salesperson is still active and still within the importing user's permitted scope, whether or not they are paused from round robin</w:t>
+      </w:r>
+    </w:p>
+    <w:p>
+      <w:pPr>
+        <w:pStyle w:val="ListBullet"/>
+        <w:numPr>
+          <w:ilvl w:val="0"/>
+          <w:numId w:val="1"/>
+        </w:numPr>
+      </w:pPr>
+      <w:r>
+        <w:t xml:space="preserve">a Team-based strategy still has at least one recipient who is active and not paused from round robin</w:t>
       </w:r>
     </w:p>
     <w:p>
@@ -45250,7 +45341,7 @@
         <w:pStyle w:val="BodyText"/>
       </w:pPr>
       <w:r>
-        <w:t xml:space="preserve">If the assignment strategy itself is invalid — for example the selected team has no eligible active recipient — the import cannot proceed on that strategy. The user must choose a different one. The import must not fall back to a different team, to the importing user, or to any Admin or Manager.</w:t>
+        <w:t xml:space="preserve">If the assignment strategy itself is invalid — for example every active member of the selected team is paused from round robin, leaving no eligible automatic recipient — the import cannot proceed on that strategy. The user must choose a different one. The import must not fall back to a different team, to the importing user, or to any Admin or Manager.</w:t>
       </w:r>
     </w:p>
     <w:p>
@@ -53593,6 +53684,18 @@
     </w:p>
     <w:p>
       <w:pPr>
+        <w:pStyle w:val="ListBullet"/>
+        <w:numPr>
+          <w:ilvl w:val="0"/>
+          <w:numId w:val="1"/>
+        </w:numPr>
+      </w:pPr>
+      <w:r>
+        <w:t xml:space="preserve">Whether each Team Lead and Salesperson is currently included in the team's automatic round-robin pool</w:t>
+      </w:r>
+    </w:p>
+    <w:p>
+      <w:pPr>
         <w:pStyle w:val="BodyText"/>
       </w:pPr>
       <w:r>
@@ -53673,6 +53776,36 @@
     </w:p>
     <w:p>
       <w:pPr>
+        <w:pStyle w:val="ListBullet"/>
+        <w:numPr>
+          <w:ilvl w:val="0"/>
+          <w:numId w:val="1"/>
+        </w:numPr>
+      </w:pPr>
+      <w:r>
+        <w:rPr>
+          <w:b/>
+        </w:rPr>
+        <w:t xml:space="preserve">Pause from round robin</w:t>
+      </w:r>
+    </w:p>
+    <w:p>
+      <w:pPr>
+        <w:pStyle w:val="ListBullet"/>
+        <w:numPr>
+          <w:ilvl w:val="0"/>
+          <w:numId w:val="1"/>
+        </w:numPr>
+      </w:pPr>
+      <w:r>
+        <w:rPr>
+          <w:b/>
+        </w:rPr>
+        <w:t xml:space="preserve">Resume round robin participation</w:t>
+      </w:r>
+    </w:p>
+    <w:p>
+      <w:pPr>
         <w:pStyle w:val="BodyText"/>
       </w:pPr>
       <w:r>
@@ -53752,6 +53885,72 @@
       </w:pPr>
       <w:r>
         <w:t xml:space="preserve">A team cannot be deactivated while it has active Salespersons or active operational records. These must be moved or reassigned first.</w:t>
+      </w:r>
+    </w:p>
+    <w:p>
+      <w:pPr>
+        <w:pStyle w:val="ListBullet"/>
+        <w:numPr>
+          <w:ilvl w:val="0"/>
+          <w:numId w:val="1"/>
+        </w:numPr>
+      </w:pPr>
+      <w:r>
+        <w:t xml:space="preserve">A Team Lead may apply </w:t>
+      </w:r>
+      <w:r>
+        <w:rPr>
+          <w:b/>
+        </w:rPr>
+        <w:t xml:space="preserve">Pause from round robin</w:t>
+      </w:r>
+      <w:r>
+        <w:t xml:space="preserve"> and </w:t>
+      </w:r>
+      <w:r>
+        <w:rPr>
+          <w:b/>
+        </w:rPr>
+        <w:t xml:space="preserve">Resume round robin participation</w:t>
+      </w:r>
+      <w:r>
+        <w:t xml:space="preserve"> to a Salesperson in their own team. A Team Lead may be paused or resumed only by the Manager to whom that Team Lead reports, or by an Admin.</w:t>
+      </w:r>
+    </w:p>
+    <w:p>
+      <w:pPr>
+        <w:pStyle w:val="ListBullet"/>
+        <w:numPr>
+          <w:ilvl w:val="0"/>
+          <w:numId w:val="1"/>
+        </w:numPr>
+      </w:pPr>
+      <w:r>
+        <w:t xml:space="preserve">These two actions control automatic Lead distribution only. They do not deactivate the user and do not change existing ownership of any record. The behaviour is defined in Section 189.1.</w:t>
+      </w:r>
+    </w:p>
+    <w:p>
+      <w:pPr>
+        <w:pStyle w:val="ListBullet"/>
+        <w:numPr>
+          <w:ilvl w:val="0"/>
+          <w:numId w:val="1"/>
+        </w:numPr>
+      </w:pPr>
+      <w:r>
+        <w:t xml:space="preserve">The screen must show clearly, for every Team Lead and Salesperson, whether that person is currently included in the team's automatic round-robin pool.</w:t>
+      </w:r>
+    </w:p>
+    <w:p>
+      <w:pPr>
+        <w:pStyle w:val="ListBullet"/>
+        <w:numPr>
+          <w:ilvl w:val="0"/>
+          <w:numId w:val="1"/>
+        </w:numPr>
+      </w:pPr>
+      <w:r>
+        <w:t xml:space="preserve">Pausing and resuming round-robin participation are auditable actions. See Section 208.</w:t>
       </w:r>
     </w:p>
     <w:p>
@@ -54926,7 +55125,7 @@
               <w:pStyle w:val="TableCell"/>
             </w:pPr>
             <w:r>
-              <w:t xml:space="preserve">Yes, within own team</w:t>
+              <w:t xml:space="preserve">Yes, within own team, while active and not paused from round robin</w:t>
             </w:r>
           </w:p>
         </w:tc>
@@ -54940,7 +55139,7 @@
               <w:pStyle w:val="TableCell"/>
             </w:pPr>
             <w:r>
-              <w:t xml:space="preserve">Yes, within own team</w:t>
+              <w:t xml:space="preserve">Yes, within own team, while active and not paused from round robin</w:t>
             </w:r>
           </w:p>
         </w:tc>
@@ -55434,6 +55633,14 @@
         <w:pStyle w:val="BodyText"/>
       </w:pPr>
       <w:r>
+        <w:t xml:space="preserve">A Team Lead or Salesperson participates in automatic Lead assignment only while they are active and not paused from round robin. Pausing is confirmed behaviour: a Team Lead may pause or resume a Salesperson in their own team, and a Team Lead may be paused or resumed only by their reporting Manager or by an Admin. It withholds a person from automatic distribution only, and never from an authorized manual or direct assignment. See Sections 2.4 and 189.1.</w:t>
+      </w:r>
+    </w:p>
+    <w:p>
+      <w:pPr>
+        <w:pStyle w:val="BodyText"/>
+      </w:pPr>
+      <w:r>
         <w:rPr>
           <w:b/>
         </w:rPr>
@@ -55601,643 +55808,923 @@
     </w:p>
     <w:p>
       <w:pPr>
-        <w:pStyle w:val="ListBullet"/>
-        <w:numPr>
-          <w:ilvl w:val="0"/>
-          <w:numId w:val="1"/>
-        </w:numPr>
-      </w:pPr>
-      <w:r>
-        <w:t xml:space="preserve">How temporary leave, pauses and availability affect a user's participation in their team's automatic Lead assignment. </w:t>
+        <w:pStyle w:val="BodyText"/>
+      </w:pPr>
+      <w:r>
+        <w:t xml:space="preserve">Once confirmed, each decision is implemented as fixed application behaviour for the relevant role. Later changes require a reviewed application change/change-control process.</w:t>
+      </w:r>
+    </w:p>
+    <w:p>
+      <w:pPr>
+        <w:pStyle w:val="BodyText"/>
+      </w:pPr>
+      <w:r>
+        <w:t xml:space="preserve">These items are also listed in the consolidated register in Section 212, together with every other decision still pending.</w:t>
+      </w:r>
+    </w:p>
+    <w:p>
+      <w:pPr>
+        <w:pStyle w:val="Heading1"/>
+      </w:pPr>
+      <w:bookmarkStart w:id="206" w:name="_Sec206"/>
+      <w:r>
+        <w:t xml:space="preserve">189. Lead Assignment</w:t>
+      </w:r>
+      <w:bookmarkEnd w:id="206"/>
+    </w:p>
+    <w:p>
+      <w:pPr>
+        <w:pStyle w:val="BodyText"/>
+      </w:pPr>
+      <w:r>
+        <w:t xml:space="preserve">Navigation:</w:t>
+      </w:r>
+    </w:p>
+    <w:p>
+      <w:pPr>
+        <w:pStyle w:val="BodyText"/>
+      </w:pPr>
+      <w:r>
+        <w:t xml:space="preserve">Settings → Lead Assignment</w:t>
+      </w:r>
+    </w:p>
+    <w:p>
+      <w:pPr>
+        <w:pStyle w:val="BodyText"/>
+      </w:pPr>
+      <w:r>
+        <w:t xml:space="preserve">Controls how a new Lead receives a Record Owner.</w:t>
+      </w:r>
+    </w:p>
+    <w:p>
+      <w:pPr>
+        <w:pStyle w:val="BodyText"/>
+      </w:pPr>
+      <w:r>
+        <w:t xml:space="preserve">A Lead's Record Owner is always a </w:t>
+      </w:r>
+      <w:r>
+        <w:rPr>
+          <w:b/>
+        </w:rPr>
+        <w:t xml:space="preserve">Team Lead or Salesperson</w:t>
+      </w:r>
+      <w:r>
+        <w:t xml:space="preserve">. Admins and Managers can never be a Lead's Record Owner, whether by manual selection, automatic assignment, import or reassignment. See Section 2.5.</w:t>
+      </w:r>
+    </w:p>
+    <w:p>
+      <w:pPr>
+        <w:pStyle w:val="BodyText"/>
+      </w:pPr>
+      <w:r>
+        <w:rPr>
+          <w:b/>
+        </w:rPr>
+        <w:t xml:space="preserve">Supported V1 modes</w:t>
+      </w:r>
+    </w:p>
+    <w:p>
+      <w:pPr>
+        <w:pStyle w:val="BodyText"/>
+      </w:pPr>
+      <w:r>
+        <w:rPr>
+          <w:b/>
+        </w:rPr>
+        <w:t xml:space="preserve">Manual</w:t>
+      </w:r>
+    </w:p>
+    <w:p>
+      <w:pPr>
+        <w:pStyle w:val="BodyText"/>
+      </w:pPr>
+      <w:r>
+        <w:t xml:space="preserve">An authorized user selects the Record Owner.</w:t>
+      </w:r>
+    </w:p>
+    <w:p>
+      <w:pPr>
+        <w:pStyle w:val="BodyText"/>
+      </w:pPr>
+      <w:r>
+        <w:t xml:space="preserve">The selectable users are limited to the Team Leads and Salespersons the acting user is permitted to assign to:</w:t>
+      </w:r>
+    </w:p>
+    <w:p>
+      <w:pPr>
+        <w:pStyle w:val="ListBullet"/>
+        <w:numPr>
+          <w:ilvl w:val="0"/>
+          <w:numId w:val="1"/>
+        </w:numPr>
+      </w:pPr>
+      <w:r>
+        <w:t xml:space="preserve">a Team Lead may assign within their own team</w:t>
+      </w:r>
+    </w:p>
+    <w:p>
+      <w:pPr>
+        <w:pStyle w:val="ListBullet"/>
+        <w:numPr>
+          <w:ilvl w:val="0"/>
+          <w:numId w:val="1"/>
+        </w:numPr>
+      </w:pPr>
+      <w:r>
+        <w:t xml:space="preserve">a Manager may assign within their own reporting hierarchy</w:t>
+      </w:r>
+    </w:p>
+    <w:p>
+      <w:pPr>
+        <w:pStyle w:val="ListBullet"/>
+        <w:numPr>
+          <w:ilvl w:val="0"/>
+          <w:numId w:val="1"/>
+        </w:numPr>
+      </w:pPr>
+      <w:r>
+        <w:t xml:space="preserve">an Admin may assign anywhere in the organization</w:t>
+      </w:r>
+    </w:p>
+    <w:p>
+      <w:pPr>
+        <w:pStyle w:val="BodyText"/>
+      </w:pPr>
+      <w:r>
+        <w:t xml:space="preserve">A supervisor who performs an assignment does not become the owner.</w:t>
+      </w:r>
+    </w:p>
+    <w:p>
+      <w:pPr>
+        <w:pStyle w:val="BodyText"/>
+      </w:pPr>
+      <w:r>
+        <w:rPr>
+          <w:b/>
+        </w:rPr>
+        <w:t xml:space="preserve">Automatic — team round robin</w:t>
+      </w:r>
+    </w:p>
+    <w:p>
+      <w:pPr>
+        <w:pStyle w:val="BodyText"/>
+      </w:pPr>
+      <w:r>
+        <w:t xml:space="preserve">Automatic assignment is always scoped to one team. It never selects a user outside the destination team.</w:t>
+      </w:r>
+    </w:p>
+    <w:p>
+      <w:pPr>
+        <w:pStyle w:val="Heading2"/>
+      </w:pPr>
+      <w:bookmarkStart w:id="207" w:name="_Sec207"/>
+      <w:r>
+        <w:t xml:space="preserve">189.1 Team Round Robin</w:t>
+      </w:r>
+      <w:bookmarkEnd w:id="207"/>
+    </w:p>
+    <w:p>
+      <w:pPr>
+        <w:pStyle w:val="BodyText"/>
+      </w:pPr>
+      <w:r>
+        <w:rPr>
+          <w:b/>
+        </w:rPr>
+        <w:t xml:space="preserve">Team selection comes first</w:t>
+      </w:r>
+    </w:p>
+    <w:p>
+      <w:pPr>
+        <w:pStyle w:val="BodyText"/>
+      </w:pPr>
+      <w:r>
+        <w:t xml:space="preserve">Automatic assignment begins only after a destination team has been selected. There is no organization-wide rotation and no rotation that spans teams.</w:t>
+      </w:r>
+    </w:p>
+    <w:p>
+      <w:pPr>
+        <w:pStyle w:val="BodyText"/>
+      </w:pPr>
+      <w:r>
+        <w:t xml:space="preserve">A destination team may be selected through:</w:t>
+      </w:r>
+    </w:p>
+    <w:p>
+      <w:pPr>
+        <w:pStyle w:val="ListBullet"/>
+        <w:numPr>
+          <w:ilvl w:val="0"/>
+          <w:numId w:val="1"/>
+        </w:numPr>
+      </w:pPr>
+      <w:r>
+        <w:t xml:space="preserve">authorized manual Lead creation</w:t>
+      </w:r>
+    </w:p>
+    <w:p>
+      <w:pPr>
+        <w:pStyle w:val="ListBullet"/>
+        <w:numPr>
+          <w:ilvl w:val="0"/>
+          <w:numId w:val="1"/>
+        </w:numPr>
+      </w:pPr>
+      <w:r>
+        <w:t xml:space="preserve">bulk import</w:t>
+      </w:r>
+    </w:p>
+    <w:p>
+      <w:pPr>
+        <w:pStyle w:val="ListBullet"/>
+        <w:numPr>
+          <w:ilvl w:val="0"/>
+          <w:numId w:val="1"/>
+        </w:numPr>
+      </w:pPr>
+      <w:r>
+        <w:t xml:space="preserve">an authorized reassignment flow</w:t>
+      </w:r>
+    </w:p>
+    <w:p>
+      <w:pPr>
+        <w:pStyle w:val="ListBullet"/>
+        <w:numPr>
+          <w:ilvl w:val="0"/>
+          <w:numId w:val="1"/>
+        </w:numPr>
+      </w:pPr>
+      <w:r>
+        <w:t xml:space="preserve">another approved Lead-ingestion flow</w:t>
+      </w:r>
+    </w:p>
+    <w:p>
+      <w:pPr>
+        <w:pStyle w:val="BodyText"/>
+      </w:pPr>
+      <w:r>
+        <w:t xml:space="preserve">The WhatsApp unknown-contact flow is </w:t>
+      </w:r>
+      <w:r>
+        <w:rPr>
+          <w:b/>
+        </w:rPr>
+        <w:t xml:space="preserve">not</w:t>
+      </w:r>
+      <w:r>
+        <w:t xml:space="preserve"> one of these. A Lead created from an unknown WhatsApp conversation is assigned </w:t>
+      </w:r>
+      <w:r>
+        <w:rPr>
+          <w:b/>
+        </w:rPr>
+        <w:t xml:space="preserve">directly</w:t>
+      </w:r>
+      <w:r>
+        <w:t xml:space="preserve"> to the active Team Lead selected by the acting Admin or Manager, and does not enter the team's round-robin pool. See Section 101.</w:t>
+      </w:r>
+    </w:p>
+    <w:p>
+      <w:pPr>
+        <w:pStyle w:val="BodyText"/>
+      </w:pPr>
+      <w:r>
+        <w:rPr>
+          <w:b/>
+        </w:rPr>
+        <w:t xml:space="preserve">Eligible pool</w:t>
+      </w:r>
+    </w:p>
+    <w:p>
+      <w:pPr>
+        <w:pStyle w:val="BodyText"/>
+      </w:pPr>
+      <w:r>
+        <w:t xml:space="preserve">For the selected team, the eligible automatic recipients are:</w:t>
+      </w:r>
+    </w:p>
+    <w:p>
+      <w:pPr>
+        <w:pStyle w:val="ListBullet"/>
+        <w:numPr>
+          <w:ilvl w:val="0"/>
+          <w:numId w:val="1"/>
+        </w:numPr>
+      </w:pPr>
+      <w:r>
+        <w:t xml:space="preserve">the team's active Team Lead, when not paused from round robin</w:t>
+      </w:r>
+    </w:p>
+    <w:p>
+      <w:pPr>
+        <w:pStyle w:val="ListBullet"/>
+        <w:numPr>
+          <w:ilvl w:val="0"/>
+          <w:numId w:val="1"/>
+        </w:numPr>
+      </w:pPr>
+      <w:r>
+        <w:t xml:space="preserve">the team's active Salespersons who are not paused from round robin</w:t>
+      </w:r>
+    </w:p>
+    <w:p>
+      <w:pPr>
+        <w:pStyle w:val="BodyText"/>
+      </w:pPr>
+      <w:r>
+        <w:t xml:space="preserve">Automatic eligibility therefore requires a user to be </w:t>
+      </w:r>
+      <w:r>
+        <w:rPr>
+          <w:b/>
+        </w:rPr>
+        <w:t xml:space="preserve">active and not paused from round robin</w:t>
+      </w:r>
+      <w:r>
+        <w:t xml:space="preserve">.</w:t>
+      </w:r>
+    </w:p>
+    <w:p>
+      <w:pPr>
+        <w:pStyle w:val="BodyText"/>
+      </w:pPr>
+      <w:r>
+        <w:t xml:space="preserve">The active Team Lead participates in the rotation on the same basis as the active Salespersons, because a Team Lead may personally work Leads and close sales.</w:t>
+      </w:r>
+    </w:p>
+    <w:p>
+      <w:pPr>
+        <w:pStyle w:val="BodyText"/>
+      </w:pPr>
+      <w:r>
+        <w:t xml:space="preserve">The following are never eligible recipients:</w:t>
+      </w:r>
+    </w:p>
+    <w:p>
+      <w:pPr>
+        <w:pStyle w:val="ListBullet"/>
+        <w:numPr>
+          <w:ilvl w:val="0"/>
+          <w:numId w:val="1"/>
+        </w:numPr>
+      </w:pPr>
+      <w:r>
+        <w:t xml:space="preserve">Admin</w:t>
+      </w:r>
+    </w:p>
+    <w:p>
+      <w:pPr>
+        <w:pStyle w:val="ListBullet"/>
+        <w:numPr>
+          <w:ilvl w:val="0"/>
+          <w:numId w:val="1"/>
+        </w:numPr>
+      </w:pPr>
+      <w:r>
+        <w:t xml:space="preserve">Manager</w:t>
+      </w:r>
+    </w:p>
+    <w:p>
+      <w:pPr>
+        <w:pStyle w:val="ListBullet"/>
+        <w:numPr>
+          <w:ilvl w:val="0"/>
+          <w:numId w:val="1"/>
+        </w:numPr>
+      </w:pPr>
+      <w:r>
+        <w:t xml:space="preserve">inactive users</w:t>
+      </w:r>
+    </w:p>
+    <w:p>
+      <w:pPr>
+        <w:pStyle w:val="ListBullet"/>
+        <w:numPr>
+          <w:ilvl w:val="0"/>
+          <w:numId w:val="1"/>
+        </w:numPr>
+      </w:pPr>
+      <w:r>
+        <w:t xml:space="preserve">users paused from round robin</w:t>
+      </w:r>
+    </w:p>
+    <w:p>
+      <w:pPr>
+        <w:pStyle w:val="ListBullet"/>
+        <w:numPr>
+          <w:ilvl w:val="0"/>
+          <w:numId w:val="1"/>
+        </w:numPr>
+      </w:pPr>
+      <w:r>
+        <w:t xml:space="preserve">any user belonging to another team</w:t>
+      </w:r>
+    </w:p>
+    <w:p>
+      <w:pPr>
+        <w:pStyle w:val="BodyText"/>
+      </w:pPr>
+      <w:r>
+        <w:rPr>
+          <w:b/>
+        </w:rPr>
+        <w:t xml:space="preserve">Pause from round robin</w:t>
+      </w:r>
+    </w:p>
+    <w:p>
+      <w:pPr>
+        <w:pStyle w:val="BodyText"/>
+      </w:pPr>
+      <w:r>
+        <w:t xml:space="preserve">A Team Lead or Salesperson may be paused from automatic round-robin assignment, and later resumed.</w:t>
+      </w:r>
+    </w:p>
+    <w:p>
+      <w:pPr>
+        <w:pStyle w:val="BodyText"/>
+      </w:pPr>
+      <w:r>
+        <w:t xml:space="preserve">Authority to pause and resume:</w:t>
+      </w:r>
+    </w:p>
+    <w:p>
+      <w:pPr>
+        <w:pStyle w:val="ListBullet"/>
+        <w:numPr>
+          <w:ilvl w:val="0"/>
+          <w:numId w:val="1"/>
+        </w:numPr>
+      </w:pPr>
+      <w:r>
+        <w:t xml:space="preserve">A Team Lead may pause or resume a Salesperson belonging to their own team.</w:t>
+      </w:r>
+    </w:p>
+    <w:p>
+      <w:pPr>
+        <w:pStyle w:val="ListBullet"/>
+        <w:numPr>
+          <w:ilvl w:val="0"/>
+          <w:numId w:val="1"/>
+        </w:numPr>
+      </w:pPr>
+      <w:r>
+        <w:t xml:space="preserve">A Team Lead may be paused or resumed only by the Manager to whom that Team Lead reports, or by an Admin.</w:t>
+      </w:r>
+    </w:p>
+    <w:p>
+      <w:pPr>
+        <w:pStyle w:val="BodyText"/>
+      </w:pPr>
+      <w:r>
+        <w:t xml:space="preserve">Effect of a pause:</w:t>
+      </w:r>
+    </w:p>
+    <w:p>
+      <w:pPr>
+        <w:pStyle w:val="ListBullet"/>
+        <w:numPr>
+          <w:ilvl w:val="0"/>
+          <w:numId w:val="1"/>
+        </w:numPr>
+      </w:pPr>
+      <w:r>
+        <w:t xml:space="preserve">Pausing affects only automatic team round-robin Lead assignment.</w:t>
+      </w:r>
+    </w:p>
+    <w:p>
+      <w:pPr>
+        <w:pStyle w:val="ListBullet"/>
+        <w:numPr>
+          <w:ilvl w:val="0"/>
+          <w:numId w:val="1"/>
+        </w:numPr>
+      </w:pPr>
+      <w:r>
+        <w:t xml:space="preserve">A paused person remains an active CRM user.</w:t>
+      </w:r>
+    </w:p>
+    <w:p>
+      <w:pPr>
+        <w:pStyle w:val="ListBullet"/>
+        <w:numPr>
+          <w:ilvl w:val="0"/>
+          <w:numId w:val="1"/>
+        </w:numPr>
+      </w:pPr>
+      <w:r>
+        <w:t xml:space="preserve">A paused person retains every Lead, Customer, Customer Purchase, WhatsApp conversation, follow-up, renewal and other assigned record they already hold.</w:t>
+      </w:r>
+    </w:p>
+    <w:p>
+      <w:pPr>
+        <w:pStyle w:val="ListBullet"/>
+        <w:numPr>
+          <w:ilvl w:val="0"/>
+          <w:numId w:val="1"/>
+        </w:numPr>
+      </w:pPr>
+      <w:r>
+        <w:t xml:space="preserve">Existing records must never be reassigned merely because their owner has been paused.</w:t>
+      </w:r>
+    </w:p>
+    <w:p>
+      <w:pPr>
+        <w:pStyle w:val="ListBullet"/>
+        <w:numPr>
+          <w:ilvl w:val="0"/>
+          <w:numId w:val="1"/>
+        </w:numPr>
+      </w:pPr>
+      <w:r>
+        <w:t xml:space="preserve">A paused person may still receive a Lead through an authorized manual assignment. Direct assignment to a specific active Team Lead or Salesperson remains permitted even when that person is paused from round robin.</w:t>
+      </w:r>
+    </w:p>
+    <w:p>
+      <w:pPr>
+        <w:pStyle w:val="ListBullet"/>
+        <w:numPr>
+          <w:ilvl w:val="0"/>
+          <w:numId w:val="1"/>
+        </w:numPr>
+      </w:pPr>
+      <w:r>
+        <w:t xml:space="preserve">New automatic round-robin assignments skip every paused member.</w:t>
+      </w:r>
+    </w:p>
+    <w:p>
+      <w:pPr>
+        <w:pStyle w:val="BodyText"/>
+      </w:pPr>
+      <w:r>
+        <w:t xml:space="preserve">Resuming:</w:t>
+      </w:r>
+    </w:p>
+    <w:p>
+      <w:pPr>
+        <w:pStyle w:val="ListBullet"/>
+        <w:numPr>
+          <w:ilvl w:val="0"/>
+          <w:numId w:val="1"/>
+        </w:numPr>
+      </w:pPr>
+      <w:r>
+        <w:t xml:space="preserve">When resumed, the person becomes eligible for future round-robin assignments again.</w:t>
+      </w:r>
+    </w:p>
+    <w:p>
+      <w:pPr>
+        <w:pStyle w:val="ListBullet"/>
+        <w:numPr>
+          <w:ilvl w:val="0"/>
+          <w:numId w:val="1"/>
+        </w:numPr>
+      </w:pPr>
+      <w:r>
+        <w:t xml:space="preserve">Resuming does not retroactively allocate Leads that were skipped while the person was paused.</w:t>
+      </w:r>
+    </w:p>
+    <w:p>
+      <w:pPr>
+        <w:pStyle w:val="BodyText"/>
+      </w:pPr>
+      <w:r>
+        <w:t xml:space="preserve">Safety:</w:t>
+      </w:r>
+    </w:p>
+    <w:p>
+      <w:pPr>
+        <w:pStyle w:val="ListBullet"/>
+        <w:numPr>
+          <w:ilvl w:val="0"/>
+          <w:numId w:val="1"/>
+        </w:numPr>
+      </w:pPr>
+      <w:r>
+        <w:t xml:space="preserve">If every otherwise eligible member of a team is paused, that team has no eligible automatic round-robin recipient, and the empty-pool behaviour defined below applies unchanged.</w:t>
+      </w:r>
+    </w:p>
+    <w:p>
+      <w:pPr>
+        <w:pStyle w:val="ListBullet"/>
+        <w:numPr>
+          <w:ilvl w:val="0"/>
+          <w:numId w:val="1"/>
+        </w:numPr>
+      </w:pPr>
+      <w:r>
+        <w:t xml:space="preserve">Pausing must never cause assignment to spill into another team, and must never cause a fallback to an Admin or a Manager.</w:t>
+      </w:r>
+    </w:p>
+    <w:p>
+      <w:pPr>
+        <w:pStyle w:val="ListBullet"/>
+        <w:numPr>
+          <w:ilvl w:val="0"/>
+          <w:numId w:val="1"/>
+        </w:numPr>
+      </w:pPr>
+      <w:r>
+        <w:t xml:space="preserve">Pause and resume must be authorized on the server, and each action is recorded in audit history. See Section 208.</w:t>
+      </w:r>
+    </w:p>
+    <w:p>
+      <w:pPr>
+        <w:pStyle w:val="BodyText"/>
+      </w:pPr>
+      <w:r>
+        <w:t xml:space="preserve">The interface term is </w:t>
+      </w:r>
+      <w:r>
+        <w:rPr>
+          <w:b/>
+        </w:rPr>
+        <w:t xml:space="preserve">Pause from round robin</w:t>
+      </w:r>
+      <w:r>
+        <w:t xml:space="preserve">, never the ambiguous "Pause user".</w:t>
+      </w:r>
+    </w:p>
+    <w:p>
+      <w:pPr>
+        <w:pStyle w:val="BodyText"/>
+      </w:pPr>
+      <w:r>
+        <w:t xml:space="preserve">The distinction from deactivation is exact:</w:t>
+      </w:r>
+    </w:p>
+    <w:p>
+      <w:pPr>
+        <w:pStyle w:val="ListBullet"/>
+        <w:numPr>
+          <w:ilvl w:val="0"/>
+          <w:numId w:val="1"/>
+        </w:numPr>
+      </w:pPr>
+      <w:r>
+        <w:t xml:space="preserve">An </w:t>
+      </w:r>
+      <w:r>
+        <w:rPr>
+          <w:b/>
+        </w:rPr>
+        <w:t xml:space="preserve">inactive</w:t>
+      </w:r>
+      <w:r>
+        <w:t xml:space="preserve"> user cannot receive automatic or manual operational assignments at all.</w:t>
+      </w:r>
+    </w:p>
+    <w:p>
+      <w:pPr>
+        <w:pStyle w:val="ListBullet"/>
+        <w:numPr>
+          <w:ilvl w:val="0"/>
+          <w:numId w:val="1"/>
+        </w:numPr>
+      </w:pPr>
+      <w:r>
+        <w:t xml:space="preserve">A user who is </w:t>
+      </w:r>
+      <w:r>
+        <w:rPr>
+          <w:b/>
+        </w:rPr>
+        <w:t xml:space="preserve">active but paused from round robin</w:t>
+      </w:r>
+      <w:r>
+        <w:t xml:space="preserve"> is skipped by automatic round robin, and may still receive an authorized manual or direct assignment.</w:t>
+      </w:r>
+    </w:p>
+    <w:p>
+      <w:pPr>
+        <w:pStyle w:val="BodyText"/>
+      </w:pPr>
+      <w:r>
+        <w:rPr>
+          <w:b/>
+        </w:rPr>
+        <w:t xml:space="preserve">Batch size</w:t>
+      </w:r>
+    </w:p>
+    <w:p>
+      <w:pPr>
+        <w:pStyle w:val="BodyText"/>
+      </w:pPr>
+      <w:r>
+        <w:t xml:space="preserve">Admin configures a round-robin </w:t>
+      </w:r>
+      <w:r>
+        <w:rPr>
+          <w:b/>
+        </w:rPr>
+        <w:t xml:space="preserve">batch size for each team</w:t>
+      </w:r>
+      <w:r>
+        <w:t xml:space="preserve">. The batch size determines how many consecutive Leads one eligible team member receives before assignment rotates to the next eligible member of the same team.</w:t>
+      </w:r>
+    </w:p>
+    <w:p>
+      <w:pPr>
+        <w:pStyle w:val="BodyText"/>
+      </w:pPr>
+      <w:r>
+        <w:t xml:space="preserve">Example, for one team with batch size 1:</w:t>
+      </w:r>
+    </w:p>
+    <w:p>
+      <w:pPr>
+        <w:pStyle w:val="Quote"/>
+      </w:pPr>
+      <w:r>
+        <w:t xml:space="preserve">Team: Kochi Health Team</w:t>
+      </w:r>
+    </w:p>
+    <w:p>
+      <w:pPr>
+        <w:pStyle w:val="Quote"/>
+      </w:pPr>
+      <w:r>
+        <w:t xml:space="preserve">Eligible: Arun (Team Lead), Sneha (Salesperson), Joseph (Salesperson)</w:t>
+      </w:r>
+    </w:p>
+    <w:p>
+      <w:pPr>
+        <w:pStyle w:val="Quote"/>
+      </w:pPr>
+      <w:r>
+        <w:t xml:space="preserve">Lead 1 → Arun</w:t>
+      </w:r>
+    </w:p>
+    <w:p>
+      <w:pPr>
+        <w:pStyle w:val="Quote"/>
+      </w:pPr>
+      <w:r>
+        <w:t xml:space="preserve">Lead 2 → Sneha</w:t>
+      </w:r>
+    </w:p>
+    <w:p>
+      <w:pPr>
+        <w:pStyle w:val="Quote"/>
+      </w:pPr>
+      <w:r>
+        <w:t xml:space="preserve">Lead 3 → Joseph</w:t>
+      </w:r>
+    </w:p>
+    <w:p>
+      <w:pPr>
+        <w:pStyle w:val="Quote"/>
+      </w:pPr>
+      <w:r>
+        <w:t xml:space="preserve">Lead 4 → Arun</w:t>
+      </w:r>
+    </w:p>
+    <w:p>
+      <w:pPr>
+        <w:pStyle w:val="BodyText"/>
+      </w:pPr>
+      <w:r>
+        <w:t xml:space="preserve">The same team with batch size 10:</w:t>
+      </w:r>
+    </w:p>
+    <w:p>
+      <w:pPr>
+        <w:pStyle w:val="Quote"/>
+      </w:pPr>
+      <w:r>
+        <w:t xml:space="preserve">Leads 1–10 → Arun</w:t>
+      </w:r>
+    </w:p>
+    <w:p>
+      <w:pPr>
+        <w:pStyle w:val="Quote"/>
+      </w:pPr>
+      <w:r>
+        <w:t xml:space="preserve">Leads 11–20 → Sneha</w:t>
+      </w:r>
+    </w:p>
+    <w:p>
+      <w:pPr>
+        <w:pStyle w:val="Quote"/>
+      </w:pPr>
+      <w:r>
+        <w:t xml:space="preserve">Leads 21–30 → Joseph</w:t>
+      </w:r>
+    </w:p>
+    <w:p>
+      <w:pPr>
+        <w:pStyle w:val="Quote"/>
+      </w:pPr>
+      <w:r>
+        <w:t xml:space="preserve">Leads 31–40 → Arun</w:t>
+      </w:r>
+    </w:p>
+    <w:p>
+      <w:pPr>
+        <w:pStyle w:val="BodyText"/>
+      </w:pPr>
+      <w:r>
+        <w:t xml:space="preserve">Rules:</w:t>
+      </w:r>
+    </w:p>
+    <w:p>
+      <w:pPr>
+        <w:pStyle w:val="ListBullet"/>
+        <w:numPr>
+          <w:ilvl w:val="0"/>
+          <w:numId w:val="1"/>
+        </w:numPr>
+      </w:pPr>
+      <w:r>
+        <w:t xml:space="preserve">Rotation stays entirely inside the selected team.</w:t>
+      </w:r>
+    </w:p>
+    <w:p>
+      <w:pPr>
+        <w:pStyle w:val="ListBullet"/>
+        <w:numPr>
+          <w:ilvl w:val="0"/>
+          <w:numId w:val="1"/>
+        </w:numPr>
+      </w:pPr>
+      <w:r>
+        <w:t xml:space="preserve">Each team has its own batch size and its own rotation position.</w:t>
+      </w:r>
+    </w:p>
+    <w:p>
+      <w:pPr>
+        <w:pStyle w:val="ListBullet"/>
+        <w:numPr>
+          <w:ilvl w:val="0"/>
+          <w:numId w:val="1"/>
+        </w:numPr>
+      </w:pPr>
+      <w:r>
+        <w:t xml:space="preserve">A member paused from round robin is skipped, and rotation moves to the next member who is active and not paused.</w:t>
+      </w:r>
+    </w:p>
+    <w:p>
+      <w:pPr>
+        <w:pStyle w:val="ListBullet"/>
+        <w:numPr>
+          <w:ilvl w:val="0"/>
+          <w:numId w:val="1"/>
+        </w:numPr>
+      </w:pPr>
+      <w:r>
+        <w:t xml:space="preserve">Admin and Manager never enter the rotation.</w:t>
+      </w:r>
+    </w:p>
+    <w:p>
+      <w:pPr>
+        <w:pStyle w:val="ListBullet"/>
+        <w:numPr>
+          <w:ilvl w:val="0"/>
+          <w:numId w:val="1"/>
+        </w:numPr>
+      </w:pPr>
+      <w:r>
+        <w:t xml:space="preserve">A batch size of zero or a negative value must not be accepted.</w:t>
+      </w:r>
+    </w:p>
+    <w:p>
+      <w:pPr>
+        <w:pStyle w:val="ListBullet"/>
+        <w:numPr>
+          <w:ilvl w:val="0"/>
+          <w:numId w:val="1"/>
+        </w:numPr>
+      </w:pPr>
+      <w:r>
+        <w:t xml:space="preserve">Changing the batch size or the eligible members affects future automatic assignments only. Existing Lead ownership is never rewritten.</w:t>
+      </w:r>
+    </w:p>
+    <w:p>
+      <w:pPr>
+        <w:pStyle w:val="ListBullet"/>
+        <w:numPr>
+          <w:ilvl w:val="0"/>
+          <w:numId w:val="1"/>
+        </w:numPr>
+      </w:pPr>
+      <w:r>
+        <w:t xml:space="preserve">Batch configuration is an assignment rule, not a security permission. Configuring it does not change any role's visibility or authorization.</w:t>
+      </w:r>
+    </w:p>
+    <w:p>
+      <w:pPr>
+        <w:pStyle w:val="BodyText"/>
+      </w:pPr>
+      <w:r>
+        <w:t xml:space="preserve">The default batch size and the maximum permitted batch size are </w:t>
       </w:r>
       <w:r>
         <w:rPr>
           <w:i/>
         </w:rPr>
-        <w:t xml:space="preserve">Pending client confirmation before security implementation and UAT.</w:t>
-      </w:r>
-    </w:p>
-    <w:p>
-      <w:pPr>
-        <w:pStyle w:val="BodyText"/>
-      </w:pPr>
-      <w:r>
-        <w:t xml:space="preserve">Once confirmed, each decision is implemented as fixed application behaviour for the relevant role. Later changes require a reviewed application change/change-control process.</w:t>
-      </w:r>
-    </w:p>
-    <w:p>
-      <w:pPr>
-        <w:pStyle w:val="BodyText"/>
-      </w:pPr>
-      <w:r>
-        <w:t xml:space="preserve">These items are also listed in the consolidated register in Section 212, together with every other decision still pending.</w:t>
-      </w:r>
-    </w:p>
-    <w:p>
-      <w:pPr>
-        <w:pStyle w:val="Heading1"/>
-      </w:pPr>
-      <w:bookmarkStart w:id="206" w:name="_Sec206"/>
-      <w:r>
-        <w:t xml:space="preserve">189. Lead Assignment</w:t>
-      </w:r>
-      <w:bookmarkEnd w:id="206"/>
-    </w:p>
-    <w:p>
-      <w:pPr>
-        <w:pStyle w:val="BodyText"/>
-      </w:pPr>
-      <w:r>
-        <w:t xml:space="preserve">Navigation:</w:t>
-      </w:r>
-    </w:p>
-    <w:p>
-      <w:pPr>
-        <w:pStyle w:val="BodyText"/>
-      </w:pPr>
-      <w:r>
-        <w:t xml:space="preserve">Settings → Lead Assignment</w:t>
-      </w:r>
-    </w:p>
-    <w:p>
-      <w:pPr>
-        <w:pStyle w:val="BodyText"/>
-      </w:pPr>
-      <w:r>
-        <w:t xml:space="preserve">Controls how a new Lead receives a Record Owner.</w:t>
-      </w:r>
-    </w:p>
-    <w:p>
-      <w:pPr>
-        <w:pStyle w:val="BodyText"/>
-      </w:pPr>
-      <w:r>
-        <w:t xml:space="preserve">A Lead's Record Owner is always a </w:t>
-      </w:r>
-      <w:r>
-        <w:rPr>
-          <w:b/>
-        </w:rPr>
-        <w:t xml:space="preserve">Team Lead or Salesperson</w:t>
-      </w:r>
-      <w:r>
-        <w:t xml:space="preserve">. Admins and Managers can never be a Lead's Record Owner, whether by manual selection, automatic assignment, import or reassignment. See Section 2.5.</w:t>
-      </w:r>
-    </w:p>
-    <w:p>
-      <w:pPr>
-        <w:pStyle w:val="BodyText"/>
-      </w:pPr>
-      <w:r>
-        <w:rPr>
-          <w:b/>
-        </w:rPr>
-        <w:t xml:space="preserve">Supported V1 modes</w:t>
-      </w:r>
-    </w:p>
-    <w:p>
-      <w:pPr>
-        <w:pStyle w:val="BodyText"/>
-      </w:pPr>
-      <w:r>
-        <w:rPr>
-          <w:b/>
-        </w:rPr>
-        <w:t xml:space="preserve">Manual</w:t>
-      </w:r>
-    </w:p>
-    <w:p>
-      <w:pPr>
-        <w:pStyle w:val="BodyText"/>
-      </w:pPr>
-      <w:r>
-        <w:t xml:space="preserve">An authorized user selects the Record Owner.</w:t>
-      </w:r>
-    </w:p>
-    <w:p>
-      <w:pPr>
-        <w:pStyle w:val="BodyText"/>
-      </w:pPr>
-      <w:r>
-        <w:t xml:space="preserve">The selectable users are limited to the Team Leads and Salespersons the acting user is permitted to assign to:</w:t>
-      </w:r>
-    </w:p>
-    <w:p>
-      <w:pPr>
-        <w:pStyle w:val="ListBullet"/>
-        <w:numPr>
-          <w:ilvl w:val="0"/>
-          <w:numId w:val="1"/>
-        </w:numPr>
-      </w:pPr>
-      <w:r>
-        <w:t xml:space="preserve">a Team Lead may assign within their own team</w:t>
-      </w:r>
-    </w:p>
-    <w:p>
-      <w:pPr>
-        <w:pStyle w:val="ListBullet"/>
-        <w:numPr>
-          <w:ilvl w:val="0"/>
-          <w:numId w:val="1"/>
-        </w:numPr>
-      </w:pPr>
-      <w:r>
-        <w:t xml:space="preserve">a Manager may assign within their own reporting hierarchy</w:t>
-      </w:r>
-    </w:p>
-    <w:p>
-      <w:pPr>
-        <w:pStyle w:val="ListBullet"/>
-        <w:numPr>
-          <w:ilvl w:val="0"/>
-          <w:numId w:val="1"/>
-        </w:numPr>
-      </w:pPr>
-      <w:r>
-        <w:t xml:space="preserve">an Admin may assign anywhere in the organization</w:t>
-      </w:r>
-    </w:p>
-    <w:p>
-      <w:pPr>
-        <w:pStyle w:val="BodyText"/>
-      </w:pPr>
-      <w:r>
-        <w:t xml:space="preserve">A supervisor who performs an assignment does not become the owner.</w:t>
-      </w:r>
-    </w:p>
-    <w:p>
-      <w:pPr>
-        <w:pStyle w:val="BodyText"/>
-      </w:pPr>
-      <w:r>
-        <w:rPr>
-          <w:b/>
-        </w:rPr>
-        <w:t xml:space="preserve">Automatic — team round robin</w:t>
-      </w:r>
-    </w:p>
-    <w:p>
-      <w:pPr>
-        <w:pStyle w:val="BodyText"/>
-      </w:pPr>
-      <w:r>
-        <w:t xml:space="preserve">Automatic assignment is always scoped to one team. It never selects a user outside the destination team.</w:t>
-      </w:r>
-    </w:p>
-    <w:p>
-      <w:pPr>
-        <w:pStyle w:val="Heading2"/>
-      </w:pPr>
-      <w:bookmarkStart w:id="207" w:name="_Sec207"/>
-      <w:r>
-        <w:t xml:space="preserve">189.1 Team Round Robin</w:t>
-      </w:r>
-      <w:bookmarkEnd w:id="207"/>
-    </w:p>
-    <w:p>
-      <w:pPr>
-        <w:pStyle w:val="BodyText"/>
-      </w:pPr>
-      <w:r>
-        <w:rPr>
-          <w:b/>
-        </w:rPr>
-        <w:t xml:space="preserve">Team selection comes first</w:t>
-      </w:r>
-    </w:p>
-    <w:p>
-      <w:pPr>
-        <w:pStyle w:val="BodyText"/>
-      </w:pPr>
-      <w:r>
-        <w:t xml:space="preserve">Automatic assignment begins only after a destination team has been selected. There is no organization-wide rotation and no rotation that spans teams.</w:t>
-      </w:r>
-    </w:p>
-    <w:p>
-      <w:pPr>
-        <w:pStyle w:val="BodyText"/>
-      </w:pPr>
-      <w:r>
-        <w:t xml:space="preserve">A destination team may be selected through:</w:t>
-      </w:r>
-    </w:p>
-    <w:p>
-      <w:pPr>
-        <w:pStyle w:val="ListBullet"/>
-        <w:numPr>
-          <w:ilvl w:val="0"/>
-          <w:numId w:val="1"/>
-        </w:numPr>
-      </w:pPr>
-      <w:r>
-        <w:t xml:space="preserve">authorized manual Lead creation</w:t>
-      </w:r>
-    </w:p>
-    <w:p>
-      <w:pPr>
-        <w:pStyle w:val="ListBullet"/>
-        <w:numPr>
-          <w:ilvl w:val="0"/>
-          <w:numId w:val="1"/>
-        </w:numPr>
-      </w:pPr>
-      <w:r>
-        <w:t xml:space="preserve">bulk import</w:t>
-      </w:r>
-    </w:p>
-    <w:p>
-      <w:pPr>
-        <w:pStyle w:val="ListBullet"/>
-        <w:numPr>
-          <w:ilvl w:val="0"/>
-          <w:numId w:val="1"/>
-        </w:numPr>
-      </w:pPr>
-      <w:r>
-        <w:t xml:space="preserve">an authorized reassignment flow</w:t>
-      </w:r>
-    </w:p>
-    <w:p>
-      <w:pPr>
-        <w:pStyle w:val="ListBullet"/>
-        <w:numPr>
-          <w:ilvl w:val="0"/>
-          <w:numId w:val="1"/>
-        </w:numPr>
-      </w:pPr>
-      <w:r>
-        <w:t xml:space="preserve">another approved Lead-ingestion flow</w:t>
-      </w:r>
-    </w:p>
-    <w:p>
-      <w:pPr>
-        <w:pStyle w:val="BodyText"/>
-      </w:pPr>
-      <w:r>
-        <w:t xml:space="preserve">The WhatsApp unknown-contact flow is </w:t>
-      </w:r>
-      <w:r>
-        <w:rPr>
-          <w:b/>
-        </w:rPr>
-        <w:t xml:space="preserve">not</w:t>
-      </w:r>
-      <w:r>
-        <w:t xml:space="preserve"> one of these. A Lead created from an unknown WhatsApp conversation is assigned </w:t>
-      </w:r>
-      <w:r>
-        <w:rPr>
-          <w:b/>
-        </w:rPr>
-        <w:t xml:space="preserve">directly</w:t>
-      </w:r>
-      <w:r>
-        <w:t xml:space="preserve"> to the active Team Lead selected by the acting Admin or Manager, and does not enter the team's round-robin pool. See Section 101.</w:t>
-      </w:r>
-    </w:p>
-    <w:p>
-      <w:pPr>
-        <w:pStyle w:val="BodyText"/>
-      </w:pPr>
-      <w:r>
-        <w:rPr>
-          <w:b/>
-        </w:rPr>
-        <w:t xml:space="preserve">Eligible pool</w:t>
-      </w:r>
-    </w:p>
-    <w:p>
-      <w:pPr>
-        <w:pStyle w:val="BodyText"/>
-      </w:pPr>
-      <w:r>
-        <w:t xml:space="preserve">For the selected team, the eligible automatic recipients are:</w:t>
-      </w:r>
-    </w:p>
-    <w:p>
-      <w:pPr>
-        <w:pStyle w:val="ListBullet"/>
-        <w:numPr>
-          <w:ilvl w:val="0"/>
-          <w:numId w:val="1"/>
-        </w:numPr>
-      </w:pPr>
-      <w:r>
-        <w:t xml:space="preserve">the team's active Team Lead</w:t>
-      </w:r>
-    </w:p>
-    <w:p>
-      <w:pPr>
-        <w:pStyle w:val="ListBullet"/>
-        <w:numPr>
-          <w:ilvl w:val="0"/>
-          <w:numId w:val="1"/>
-        </w:numPr>
-      </w:pPr>
-      <w:r>
-        <w:t xml:space="preserve">the team's active Salespersons</w:t>
-      </w:r>
-    </w:p>
-    <w:p>
-      <w:pPr>
-        <w:pStyle w:val="BodyText"/>
-      </w:pPr>
-      <w:r>
-        <w:t xml:space="preserve">The active Team Lead participates in the rotation on the same basis as the active Salespersons, because a Team Lead may personally work Leads and close sales.</w:t>
-      </w:r>
-    </w:p>
-    <w:p>
-      <w:pPr>
-        <w:pStyle w:val="BodyText"/>
-      </w:pPr>
-      <w:r>
-        <w:t xml:space="preserve">The following are never eligible recipients:</w:t>
-      </w:r>
-    </w:p>
-    <w:p>
-      <w:pPr>
-        <w:pStyle w:val="ListBullet"/>
-        <w:numPr>
-          <w:ilvl w:val="0"/>
-          <w:numId w:val="1"/>
-        </w:numPr>
-      </w:pPr>
-      <w:r>
-        <w:t xml:space="preserve">Admin</w:t>
-      </w:r>
-    </w:p>
-    <w:p>
-      <w:pPr>
-        <w:pStyle w:val="ListBullet"/>
-        <w:numPr>
-          <w:ilvl w:val="0"/>
-          <w:numId w:val="1"/>
-        </w:numPr>
-      </w:pPr>
-      <w:r>
-        <w:t xml:space="preserve">Manager</w:t>
-      </w:r>
-    </w:p>
-    <w:p>
-      <w:pPr>
-        <w:pStyle w:val="ListBullet"/>
-        <w:numPr>
-          <w:ilvl w:val="0"/>
-          <w:numId w:val="1"/>
-        </w:numPr>
-      </w:pPr>
-      <w:r>
-        <w:t xml:space="preserve">inactive users</w:t>
-      </w:r>
-    </w:p>
-    <w:p>
-      <w:pPr>
-        <w:pStyle w:val="ListBullet"/>
-        <w:numPr>
-          <w:ilvl w:val="0"/>
-          <w:numId w:val="1"/>
-        </w:numPr>
-      </w:pPr>
-      <w:r>
-        <w:t xml:space="preserve">any user belonging to another team</w:t>
-      </w:r>
-    </w:p>
-    <w:p>
-      <w:pPr>
-        <w:pStyle w:val="BodyText"/>
-      </w:pPr>
-      <w:r>
-        <w:t xml:space="preserve">Handling of temporary leave, pauses and availability is </w:t>
-      </w:r>
-      <w:r>
-        <w:rPr>
-          <w:i/>
-        </w:rPr>
         <w:t xml:space="preserve">pending client confirmation</w:t>
       </w:r>
       <w:r>
-        <w:t xml:space="preserve">. Until it is confirmed, only the active/inactive state determines eligibility.</w:t>
-      </w:r>
-    </w:p>
-    <w:p>
-      <w:pPr>
-        <w:pStyle w:val="BodyText"/>
-      </w:pPr>
-      <w:r>
-        <w:rPr>
-          <w:b/>
-        </w:rPr>
-        <w:t xml:space="preserve">Batch size</w:t>
-      </w:r>
-    </w:p>
-    <w:p>
-      <w:pPr>
-        <w:pStyle w:val="BodyText"/>
-      </w:pPr>
-      <w:r>
-        <w:t xml:space="preserve">Admin configures a round-robin </w:t>
-      </w:r>
-      <w:r>
-        <w:rPr>
-          <w:b/>
-        </w:rPr>
-        <w:t xml:space="preserve">batch size for each team</w:t>
-      </w:r>
-      <w:r>
-        <w:t xml:space="preserve">. The batch size determines how many consecutive Leads one eligible team member receives before assignment rotates to the next eligible member of the same team.</w:t>
-      </w:r>
-    </w:p>
-    <w:p>
-      <w:pPr>
-        <w:pStyle w:val="BodyText"/>
-      </w:pPr>
-      <w:r>
-        <w:t xml:space="preserve">Example, for one team with batch size 1:</w:t>
-      </w:r>
-    </w:p>
-    <w:p>
-      <w:pPr>
-        <w:pStyle w:val="Quote"/>
-      </w:pPr>
-      <w:r>
-        <w:t xml:space="preserve">Team: Kochi Health Team</w:t>
-      </w:r>
-    </w:p>
-    <w:p>
-      <w:pPr>
-        <w:pStyle w:val="Quote"/>
-      </w:pPr>
-      <w:r>
-        <w:t xml:space="preserve">Eligible: Arun (Team Lead), Sneha (Salesperson), Joseph (Salesperson)</w:t>
-      </w:r>
-    </w:p>
-    <w:p>
-      <w:pPr>
-        <w:pStyle w:val="Quote"/>
-      </w:pPr>
-      <w:r>
-        <w:t xml:space="preserve">Lead 1 → Arun</w:t>
-      </w:r>
-    </w:p>
-    <w:p>
-      <w:pPr>
-        <w:pStyle w:val="Quote"/>
-      </w:pPr>
-      <w:r>
-        <w:t xml:space="preserve">Lead 2 → Sneha</w:t>
-      </w:r>
-    </w:p>
-    <w:p>
-      <w:pPr>
-        <w:pStyle w:val="Quote"/>
-      </w:pPr>
-      <w:r>
-        <w:t xml:space="preserve">Lead 3 → Joseph</w:t>
-      </w:r>
-    </w:p>
-    <w:p>
-      <w:pPr>
-        <w:pStyle w:val="Quote"/>
-      </w:pPr>
-      <w:r>
-        <w:t xml:space="preserve">Lead 4 → Arun</w:t>
-      </w:r>
-    </w:p>
-    <w:p>
-      <w:pPr>
-        <w:pStyle w:val="BodyText"/>
-      </w:pPr>
-      <w:r>
-        <w:t xml:space="preserve">The same team with batch size 10:</w:t>
-      </w:r>
-    </w:p>
-    <w:p>
-      <w:pPr>
-        <w:pStyle w:val="Quote"/>
-      </w:pPr>
-      <w:r>
-        <w:t xml:space="preserve">Leads 1–10 → Arun</w:t>
-      </w:r>
-    </w:p>
-    <w:p>
-      <w:pPr>
-        <w:pStyle w:val="Quote"/>
-      </w:pPr>
-      <w:r>
-        <w:t xml:space="preserve">Leads 11–20 → Sneha</w:t>
-      </w:r>
-    </w:p>
-    <w:p>
-      <w:pPr>
-        <w:pStyle w:val="Quote"/>
-      </w:pPr>
-      <w:r>
-        <w:t xml:space="preserve">Leads 21–30 → Joseph</w:t>
-      </w:r>
-    </w:p>
-    <w:p>
-      <w:pPr>
-        <w:pStyle w:val="Quote"/>
-      </w:pPr>
-      <w:r>
-        <w:t xml:space="preserve">Leads 31–40 → Arun</w:t>
-      </w:r>
-    </w:p>
-    <w:p>
-      <w:pPr>
-        <w:pStyle w:val="BodyText"/>
-      </w:pPr>
-      <w:r>
-        <w:t xml:space="preserve">Rules:</w:t>
-      </w:r>
-    </w:p>
-    <w:p>
-      <w:pPr>
-        <w:pStyle w:val="ListBullet"/>
-        <w:numPr>
-          <w:ilvl w:val="0"/>
-          <w:numId w:val="1"/>
-        </w:numPr>
-      </w:pPr>
-      <w:r>
-        <w:t xml:space="preserve">Rotation stays entirely inside the selected team.</w:t>
-      </w:r>
-    </w:p>
-    <w:p>
-      <w:pPr>
-        <w:pStyle w:val="ListBullet"/>
-        <w:numPr>
-          <w:ilvl w:val="0"/>
-          <w:numId w:val="1"/>
-        </w:numPr>
-      </w:pPr>
-      <w:r>
-        <w:t xml:space="preserve">Each team has its own batch size and its own rotation position.</w:t>
-      </w:r>
-    </w:p>
-    <w:p>
-      <w:pPr>
-        <w:pStyle w:val="ListBullet"/>
-        <w:numPr>
-          <w:ilvl w:val="0"/>
-          <w:numId w:val="1"/>
-        </w:numPr>
-      </w:pPr>
-      <w:r>
-        <w:t xml:space="preserve">Admin and Manager never enter the rotation.</w:t>
-      </w:r>
-    </w:p>
-    <w:p>
-      <w:pPr>
-        <w:pStyle w:val="ListBullet"/>
-        <w:numPr>
-          <w:ilvl w:val="0"/>
-          <w:numId w:val="1"/>
-        </w:numPr>
-      </w:pPr>
-      <w:r>
-        <w:t xml:space="preserve">A batch size of zero or a negative value must not be accepted.</w:t>
-      </w:r>
-    </w:p>
-    <w:p>
-      <w:pPr>
-        <w:pStyle w:val="ListBullet"/>
-        <w:numPr>
-          <w:ilvl w:val="0"/>
-          <w:numId w:val="1"/>
-        </w:numPr>
-      </w:pPr>
-      <w:r>
-        <w:t xml:space="preserve">Changing the batch size or the eligible members affects future automatic assignments only. Existing Lead ownership is never rewritten.</w:t>
-      </w:r>
-    </w:p>
-    <w:p>
-      <w:pPr>
-        <w:pStyle w:val="ListBullet"/>
-        <w:numPr>
-          <w:ilvl w:val="0"/>
-          <w:numId w:val="1"/>
-        </w:numPr>
-      </w:pPr>
-      <w:r>
-        <w:t xml:space="preserve">Batch configuration is an assignment rule, not a security permission. Configuring it does not change any role's visibility or authorization.</w:t>
-      </w:r>
-    </w:p>
-    <w:p>
-      <w:pPr>
-        <w:pStyle w:val="BodyText"/>
-      </w:pPr>
-      <w:r>
-        <w:t xml:space="preserve">The default batch size and the maximum permitted batch size are </w:t>
-      </w:r>
-      <w:r>
-        <w:rPr>
-          <w:i/>
-        </w:rPr>
-        <w:t xml:space="preserve">pending client confirmation</w:t>
-      </w:r>
-      <w:r>
         <w:t xml:space="preserve">.</w:t>
       </w:r>
     </w:p>
@@ -56257,7 +56744,7 @@
         <w:pStyle w:val="BodyText"/>
       </w:pPr>
       <w:r>
-        <w:t xml:space="preserve">If the selected team has no eligible active recipient, automatic assignment must fail safely and visibly.</w:t>
+        <w:t xml:space="preserve">If the selected team has no eligible automatic recipient — because every otherwise eligible member is inactive or paused from round robin — automatic assignment must fail safely and visibly.</w:t>
       </w:r>
     </w:p>
     <w:p>
@@ -60143,7 +60630,7 @@
         <w:t xml:space="preserve">Automatic Lead assignment</w:t>
       </w:r>
       <w:r>
-        <w:t xml:space="preserve"> requires a destination team with at least one eligible active recipient.</w:t>
+        <w:t xml:space="preserve"> requires a destination team with at least one recipient who is active and not paused from round robin.</w:t>
       </w:r>
     </w:p>
     <w:p>
@@ -62976,6 +63463,18 @@
         </w:numPr>
       </w:pPr>
       <w:r>
+        <w:t xml:space="preserve">pausing a person from automatic Lead round-robin assignment, and resuming their round-robin participation. Each entry retains the acting user, the target user, the timestamp, the previous state, the new state and the relevant team and reporting scope</w:t>
+      </w:r>
+    </w:p>
+    <w:p>
+      <w:pPr>
+        <w:pStyle w:val="ListBullet"/>
+        <w:numPr>
+          <w:ilvl w:val="0"/>
+          <w:numId w:val="1"/>
+        </w:numPr>
+      </w:pPr>
+      <w:r>
         <w:t xml:space="preserve">Lead Stage changes</w:t>
       </w:r>
     </w:p>
@@ -65378,18 +65877,6 @@
           <w:b/>
         </w:rPr>
         <w:t xml:space="preserve">Assignment and hierarchy</w:t>
-      </w:r>
-    </w:p>
-    <w:p>
-      <w:pPr>
-        <w:pStyle w:val="ListBullet"/>
-        <w:numPr>
-          <w:ilvl w:val="0"/>
-          <w:numId w:val="1"/>
-        </w:numPr>
-      </w:pPr>
-      <w:r>
-        <w:t xml:space="preserve">How temporary leave, pauses and availability affect a user's participation in their team's round robin.</w:t>
       </w:r>
     </w:p>
     <w:p>

</xml_diff>

<commit_message>
docs: synchronize specification DOCX with technical stack
</commit_message>
<xml_diff>
--- a/docs/AS_Fincare_CRM_Product_Spec_V1.docx
+++ b/docs/AS_Fincare_CRM_Product_Spec_V1.docx
@@ -4850,7 +4850,7 @@
         </w:numPr>
       </w:pPr>
       <w:r>
-        <w:t xml:space="preserve">Supabase / PostgreSQL</w:t>
+        <w:t xml:space="preserve">Neon-hosted PostgreSQL</w:t>
       </w:r>
     </w:p>
     <w:p>
@@ -4874,31 +4874,31 @@
         </w:numPr>
       </w:pPr>
       <w:r>
-        <w:t xml:space="preserve">Supabase Auth</w:t>
-      </w:r>
-    </w:p>
-    <w:p>
-      <w:pPr>
-        <w:pStyle w:val="ListBullet"/>
-        <w:numPr>
-          <w:ilvl w:val="0"/>
-          <w:numId w:val="1"/>
-        </w:numPr>
-      </w:pPr>
-      <w:r>
-        <w:t xml:space="preserve">Supabase Storage</w:t>
-      </w:r>
-    </w:p>
-    <w:p>
-      <w:pPr>
-        <w:pStyle w:val="ListBullet"/>
-        <w:numPr>
-          <w:ilvl w:val="0"/>
-          <w:numId w:val="1"/>
-        </w:numPr>
-      </w:pPr>
-      <w:r>
-        <w:t xml:space="preserve">Meta WhatsApp Cloud API</w:t>
+        <w:t xml:space="preserve">JWT-based authentication — implementation library/provider to be finalized</w:t>
+      </w:r>
+    </w:p>
+    <w:p>
+      <w:pPr>
+        <w:pStyle w:val="ListBullet"/>
+        <w:numPr>
+          <w:ilvl w:val="0"/>
+          <w:numId w:val="1"/>
+        </w:numPr>
+      </w:pPr>
+      <w:r>
+        <w:t xml:space="preserve">Cloudflare R2 private object storage</w:t>
+      </w:r>
+    </w:p>
+    <w:p>
+      <w:pPr>
+        <w:pStyle w:val="ListBullet"/>
+        <w:numPr>
+          <w:ilvl w:val="0"/>
+          <w:numId w:val="1"/>
+        </w:numPr>
+      </w:pPr>
+      <w:r>
+        <w:t xml:space="preserve">WhatsApp Business Platform using Cloud API with Coexistence</w:t>
       </w:r>
     </w:p>
     <w:p>

</xml_diff>